<commit_message>
表样式:移除 Light Grid Accent 1 主题色,改为 Normal Table 纯白三线表
</commit_message>
<xml_diff>
--- a/家鸡遗传学综述_v2.docx
+++ b/家鸡遗传学综述_v2.docx
@@ -624,9 +624,8 @@
     </w:p>
     <w:tbl>
       <w:tblPr>
-        <w:tblStyle w:val="LightGrid-Accent1"/>
         <w:tblW w:type="auto" w:w="0"/>
-        <w:tblLook w:firstColumn="1" w:firstRow="1" w:lastColumn="0" w:lastRow="0" w:noHBand="0" w:noVBand="1" w:val="04A0"/>
+        <w:tblLook w:firstColumn="0" w:firstRow="0" w:lastColumn="0" w:lastRow="0" w:noHBand="1" w:noVBand="1" w:val="04A0"/>
         <w:tblBorders>
           <w:top w:val="nil"/>
           <w:left w:val="nil"/>
@@ -655,6 +654,7 @@
               <w:bottom w:val="single" w:sz="6" w:space="0" w:color="000000"/>
               <w:right w:val="nil"/>
             </w:tcBorders>
+            <w:shd w:val="clear" w:color="auto" w:fill="FFFFFF"/>
           </w:tcPr>
           <w:p>
             <w:r/>
@@ -677,6 +677,7 @@
               <w:bottom w:val="single" w:sz="6" w:space="0" w:color="000000"/>
               <w:right w:val="nil"/>
             </w:tcBorders>
+            <w:shd w:val="clear" w:color="auto" w:fill="FFFFFF"/>
           </w:tcPr>
           <w:p>
             <w:r/>
@@ -699,6 +700,7 @@
               <w:bottom w:val="single" w:sz="6" w:space="0" w:color="000000"/>
               <w:right w:val="nil"/>
             </w:tcBorders>
+            <w:shd w:val="clear" w:color="auto" w:fill="FFFFFF"/>
           </w:tcPr>
           <w:p>
             <w:r/>
@@ -721,6 +723,7 @@
               <w:bottom w:val="single" w:sz="6" w:space="0" w:color="000000"/>
               <w:right w:val="nil"/>
             </w:tcBorders>
+            <w:shd w:val="clear" w:color="auto" w:fill="FFFFFF"/>
           </w:tcPr>
           <w:p>
             <w:r/>
@@ -743,6 +746,7 @@
               <w:bottom w:val="single" w:sz="6" w:space="0" w:color="000000"/>
               <w:right w:val="nil"/>
             </w:tcBorders>
+            <w:shd w:val="clear" w:color="auto" w:fill="FFFFFF"/>
           </w:tcPr>
           <w:p>
             <w:r/>
@@ -765,6 +769,7 @@
               <w:bottom w:val="single" w:sz="6" w:space="0" w:color="000000"/>
               <w:right w:val="nil"/>
             </w:tcBorders>
+            <w:shd w:val="clear" w:color="auto" w:fill="FFFFFF"/>
           </w:tcPr>
           <w:p>
             <w:r/>
@@ -787,6 +792,7 @@
               <w:bottom w:val="single" w:sz="6" w:space="0" w:color="000000"/>
               <w:right w:val="nil"/>
             </w:tcBorders>
+            <w:shd w:val="clear" w:color="auto" w:fill="FFFFFF"/>
           </w:tcPr>
           <w:p>
             <w:r/>
@@ -811,6 +817,7 @@
               <w:bottom w:val="nil"/>
               <w:right w:val="nil"/>
             </w:tcBorders>
+            <w:shd w:val="clear" w:color="auto" w:fill="FFFFFF"/>
           </w:tcPr>
           <w:p>
             <w:r/>
@@ -832,6 +839,7 @@
               <w:bottom w:val="nil"/>
               <w:right w:val="nil"/>
             </w:tcBorders>
+            <w:shd w:val="clear" w:color="auto" w:fill="FFFFFF"/>
           </w:tcPr>
           <w:p>
             <w:r/>
@@ -853,6 +861,7 @@
               <w:bottom w:val="nil"/>
               <w:right w:val="nil"/>
             </w:tcBorders>
+            <w:shd w:val="clear" w:color="auto" w:fill="FFFFFF"/>
           </w:tcPr>
           <w:p>
             <w:r/>
@@ -874,6 +883,7 @@
               <w:bottom w:val="nil"/>
               <w:right w:val="nil"/>
             </w:tcBorders>
+            <w:shd w:val="clear" w:color="auto" w:fill="FFFFFF"/>
           </w:tcPr>
           <w:p>
             <w:r/>
@@ -895,6 +905,7 @@
               <w:bottom w:val="nil"/>
               <w:right w:val="nil"/>
             </w:tcBorders>
+            <w:shd w:val="clear" w:color="auto" w:fill="FFFFFF"/>
           </w:tcPr>
           <w:p>
             <w:r/>
@@ -916,6 +927,7 @@
               <w:bottom w:val="nil"/>
               <w:right w:val="nil"/>
             </w:tcBorders>
+            <w:shd w:val="clear" w:color="auto" w:fill="FFFFFF"/>
           </w:tcPr>
           <w:p>
             <w:r/>
@@ -937,6 +949,7 @@
               <w:bottom w:val="nil"/>
               <w:right w:val="nil"/>
             </w:tcBorders>
+            <w:shd w:val="clear" w:color="auto" w:fill="FFFFFF"/>
           </w:tcPr>
           <w:p>
             <w:r/>
@@ -960,6 +973,7 @@
               <w:bottom w:val="nil"/>
               <w:right w:val="nil"/>
             </w:tcBorders>
+            <w:shd w:val="clear" w:color="auto" w:fill="FFFFFF"/>
           </w:tcPr>
           <w:p>
             <w:r/>
@@ -981,6 +995,7 @@
               <w:bottom w:val="nil"/>
               <w:right w:val="nil"/>
             </w:tcBorders>
+            <w:shd w:val="clear" w:color="auto" w:fill="FFFFFF"/>
           </w:tcPr>
           <w:p>
             <w:r/>
@@ -1002,6 +1017,7 @@
               <w:bottom w:val="nil"/>
               <w:right w:val="nil"/>
             </w:tcBorders>
+            <w:shd w:val="clear" w:color="auto" w:fill="FFFFFF"/>
           </w:tcPr>
           <w:p>
             <w:r/>
@@ -1023,6 +1039,7 @@
               <w:bottom w:val="nil"/>
               <w:right w:val="nil"/>
             </w:tcBorders>
+            <w:shd w:val="clear" w:color="auto" w:fill="FFFFFF"/>
           </w:tcPr>
           <w:p>
             <w:r/>
@@ -1044,6 +1061,7 @@
               <w:bottom w:val="nil"/>
               <w:right w:val="nil"/>
             </w:tcBorders>
+            <w:shd w:val="clear" w:color="auto" w:fill="FFFFFF"/>
           </w:tcPr>
           <w:p>
             <w:r/>
@@ -1065,6 +1083,7 @@
               <w:bottom w:val="nil"/>
               <w:right w:val="nil"/>
             </w:tcBorders>
+            <w:shd w:val="clear" w:color="auto" w:fill="FFFFFF"/>
           </w:tcPr>
           <w:p>
             <w:r/>
@@ -1086,6 +1105,7 @@
               <w:bottom w:val="nil"/>
               <w:right w:val="nil"/>
             </w:tcBorders>
+            <w:shd w:val="clear" w:color="auto" w:fill="FFFFFF"/>
           </w:tcPr>
           <w:p>
             <w:r/>
@@ -1109,6 +1129,7 @@
               <w:bottom w:val="nil"/>
               <w:right w:val="nil"/>
             </w:tcBorders>
+            <w:shd w:val="clear" w:color="auto" w:fill="FFFFFF"/>
           </w:tcPr>
           <w:p>
             <w:r/>
@@ -1130,6 +1151,7 @@
               <w:bottom w:val="nil"/>
               <w:right w:val="nil"/>
             </w:tcBorders>
+            <w:shd w:val="clear" w:color="auto" w:fill="FFFFFF"/>
           </w:tcPr>
           <w:p>
             <w:r/>
@@ -1151,6 +1173,7 @@
               <w:bottom w:val="nil"/>
               <w:right w:val="nil"/>
             </w:tcBorders>
+            <w:shd w:val="clear" w:color="auto" w:fill="FFFFFF"/>
           </w:tcPr>
           <w:p>
             <w:r/>
@@ -1172,6 +1195,7 @@
               <w:bottom w:val="nil"/>
               <w:right w:val="nil"/>
             </w:tcBorders>
+            <w:shd w:val="clear" w:color="auto" w:fill="FFFFFF"/>
           </w:tcPr>
           <w:p>
             <w:r/>
@@ -1193,6 +1217,7 @@
               <w:bottom w:val="nil"/>
               <w:right w:val="nil"/>
             </w:tcBorders>
+            <w:shd w:val="clear" w:color="auto" w:fill="FFFFFF"/>
           </w:tcPr>
           <w:p>
             <w:r/>
@@ -1214,6 +1239,7 @@
               <w:bottom w:val="nil"/>
               <w:right w:val="nil"/>
             </w:tcBorders>
+            <w:shd w:val="clear" w:color="auto" w:fill="FFFFFF"/>
           </w:tcPr>
           <w:p>
             <w:r/>
@@ -1235,6 +1261,7 @@
               <w:bottom w:val="nil"/>
               <w:right w:val="nil"/>
             </w:tcBorders>
+            <w:shd w:val="clear" w:color="auto" w:fill="FFFFFF"/>
           </w:tcPr>
           <w:p>
             <w:r/>
@@ -1258,6 +1285,7 @@
               <w:bottom w:val="nil"/>
               <w:right w:val="nil"/>
             </w:tcBorders>
+            <w:shd w:val="clear" w:color="auto" w:fill="FFFFFF"/>
           </w:tcPr>
           <w:p>
             <w:r/>
@@ -1279,6 +1307,7 @@
               <w:bottom w:val="nil"/>
               <w:right w:val="nil"/>
             </w:tcBorders>
+            <w:shd w:val="clear" w:color="auto" w:fill="FFFFFF"/>
           </w:tcPr>
           <w:p>
             <w:r/>
@@ -1300,6 +1329,7 @@
               <w:bottom w:val="nil"/>
               <w:right w:val="nil"/>
             </w:tcBorders>
+            <w:shd w:val="clear" w:color="auto" w:fill="FFFFFF"/>
           </w:tcPr>
           <w:p>
             <w:r/>
@@ -1321,6 +1351,7 @@
               <w:bottom w:val="nil"/>
               <w:right w:val="nil"/>
             </w:tcBorders>
+            <w:shd w:val="clear" w:color="auto" w:fill="FFFFFF"/>
           </w:tcPr>
           <w:p>
             <w:r/>
@@ -1342,6 +1373,7 @@
               <w:bottom w:val="nil"/>
               <w:right w:val="nil"/>
             </w:tcBorders>
+            <w:shd w:val="clear" w:color="auto" w:fill="FFFFFF"/>
           </w:tcPr>
           <w:p>
             <w:r/>
@@ -1363,6 +1395,7 @@
               <w:bottom w:val="nil"/>
               <w:right w:val="nil"/>
             </w:tcBorders>
+            <w:shd w:val="clear" w:color="auto" w:fill="FFFFFF"/>
           </w:tcPr>
           <w:p>
             <w:r/>
@@ -1384,6 +1417,7 @@
               <w:bottom w:val="nil"/>
               <w:right w:val="nil"/>
             </w:tcBorders>
+            <w:shd w:val="clear" w:color="auto" w:fill="FFFFFF"/>
           </w:tcPr>
           <w:p>
             <w:r/>
@@ -1407,6 +1441,7 @@
               <w:bottom w:val="nil"/>
               <w:right w:val="nil"/>
             </w:tcBorders>
+            <w:shd w:val="clear" w:color="auto" w:fill="FFFFFF"/>
           </w:tcPr>
           <w:p>
             <w:r/>
@@ -1428,6 +1463,7 @@
               <w:bottom w:val="nil"/>
               <w:right w:val="nil"/>
             </w:tcBorders>
+            <w:shd w:val="clear" w:color="auto" w:fill="FFFFFF"/>
           </w:tcPr>
           <w:p>
             <w:r/>
@@ -1449,6 +1485,7 @@
               <w:bottom w:val="nil"/>
               <w:right w:val="nil"/>
             </w:tcBorders>
+            <w:shd w:val="clear" w:color="auto" w:fill="FFFFFF"/>
           </w:tcPr>
           <w:p>
             <w:r/>
@@ -1470,6 +1507,7 @@
               <w:bottom w:val="nil"/>
               <w:right w:val="nil"/>
             </w:tcBorders>
+            <w:shd w:val="clear" w:color="auto" w:fill="FFFFFF"/>
           </w:tcPr>
           <w:p>
             <w:r/>
@@ -1491,6 +1529,7 @@
               <w:bottom w:val="nil"/>
               <w:right w:val="nil"/>
             </w:tcBorders>
+            <w:shd w:val="clear" w:color="auto" w:fill="FFFFFF"/>
           </w:tcPr>
           <w:p>
             <w:r/>
@@ -1512,6 +1551,7 @@
               <w:bottom w:val="nil"/>
               <w:right w:val="nil"/>
             </w:tcBorders>
+            <w:shd w:val="clear" w:color="auto" w:fill="FFFFFF"/>
           </w:tcPr>
           <w:p>
             <w:r/>
@@ -1533,6 +1573,7 @@
               <w:bottom w:val="nil"/>
               <w:right w:val="nil"/>
             </w:tcBorders>
+            <w:shd w:val="clear" w:color="auto" w:fill="FFFFFF"/>
           </w:tcPr>
           <w:p>
             <w:r/>
@@ -1556,6 +1597,7 @@
               <w:bottom w:val="nil"/>
               <w:right w:val="nil"/>
             </w:tcBorders>
+            <w:shd w:val="clear" w:color="auto" w:fill="FFFFFF"/>
           </w:tcPr>
           <w:p>
             <w:r/>
@@ -1577,6 +1619,7 @@
               <w:bottom w:val="nil"/>
               <w:right w:val="nil"/>
             </w:tcBorders>
+            <w:shd w:val="clear" w:color="auto" w:fill="FFFFFF"/>
           </w:tcPr>
           <w:p>
             <w:r/>
@@ -1598,6 +1641,7 @@
               <w:bottom w:val="nil"/>
               <w:right w:val="nil"/>
             </w:tcBorders>
+            <w:shd w:val="clear" w:color="auto" w:fill="FFFFFF"/>
           </w:tcPr>
           <w:p>
             <w:r/>
@@ -1619,6 +1663,7 @@
               <w:bottom w:val="nil"/>
               <w:right w:val="nil"/>
             </w:tcBorders>
+            <w:shd w:val="clear" w:color="auto" w:fill="FFFFFF"/>
           </w:tcPr>
           <w:p>
             <w:r/>
@@ -1640,6 +1685,7 @@
               <w:bottom w:val="nil"/>
               <w:right w:val="nil"/>
             </w:tcBorders>
+            <w:shd w:val="clear" w:color="auto" w:fill="FFFFFF"/>
           </w:tcPr>
           <w:p>
             <w:r/>
@@ -1661,6 +1707,7 @@
               <w:bottom w:val="nil"/>
               <w:right w:val="nil"/>
             </w:tcBorders>
+            <w:shd w:val="clear" w:color="auto" w:fill="FFFFFF"/>
           </w:tcPr>
           <w:p>
             <w:r/>
@@ -1682,6 +1729,7 @@
               <w:bottom w:val="nil"/>
               <w:right w:val="nil"/>
             </w:tcBorders>
+            <w:shd w:val="clear" w:color="auto" w:fill="FFFFFF"/>
           </w:tcPr>
           <w:p>
             <w:r/>
@@ -1705,6 +1753,7 @@
               <w:bottom w:val="nil"/>
               <w:right w:val="nil"/>
             </w:tcBorders>
+            <w:shd w:val="clear" w:color="auto" w:fill="FFFFFF"/>
           </w:tcPr>
           <w:p>
             <w:r/>
@@ -1726,6 +1775,7 @@
               <w:bottom w:val="nil"/>
               <w:right w:val="nil"/>
             </w:tcBorders>
+            <w:shd w:val="clear" w:color="auto" w:fill="FFFFFF"/>
           </w:tcPr>
           <w:p>
             <w:r/>
@@ -1747,6 +1797,7 @@
               <w:bottom w:val="nil"/>
               <w:right w:val="nil"/>
             </w:tcBorders>
+            <w:shd w:val="clear" w:color="auto" w:fill="FFFFFF"/>
           </w:tcPr>
           <w:p>
             <w:r/>
@@ -1768,6 +1819,7 @@
               <w:bottom w:val="nil"/>
               <w:right w:val="nil"/>
             </w:tcBorders>
+            <w:shd w:val="clear" w:color="auto" w:fill="FFFFFF"/>
           </w:tcPr>
           <w:p>
             <w:r/>
@@ -1789,6 +1841,7 @@
               <w:bottom w:val="nil"/>
               <w:right w:val="nil"/>
             </w:tcBorders>
+            <w:shd w:val="clear" w:color="auto" w:fill="FFFFFF"/>
           </w:tcPr>
           <w:p>
             <w:r/>
@@ -1810,6 +1863,7 @@
               <w:bottom w:val="nil"/>
               <w:right w:val="nil"/>
             </w:tcBorders>
+            <w:shd w:val="clear" w:color="auto" w:fill="FFFFFF"/>
           </w:tcPr>
           <w:p>
             <w:r/>
@@ -1831,6 +1885,7 @@
               <w:bottom w:val="nil"/>
               <w:right w:val="nil"/>
             </w:tcBorders>
+            <w:shd w:val="clear" w:color="auto" w:fill="FFFFFF"/>
           </w:tcPr>
           <w:p>
             <w:r/>
@@ -1854,6 +1909,7 @@
               <w:bottom w:val="single" w:sz="12" w:space="0" w:color="000000"/>
               <w:right w:val="nil"/>
             </w:tcBorders>
+            <w:shd w:val="clear" w:color="auto" w:fill="FFFFFF"/>
           </w:tcPr>
           <w:p>
             <w:r/>
@@ -1871,6 +1927,7 @@
               <w:bottom w:val="single" w:sz="12" w:space="0" w:color="000000"/>
               <w:right w:val="nil"/>
             </w:tcBorders>
+            <w:shd w:val="clear" w:color="auto" w:fill="FFFFFF"/>
           </w:tcPr>
           <w:p>
             <w:r/>
@@ -1888,6 +1945,7 @@
               <w:bottom w:val="single" w:sz="12" w:space="0" w:color="000000"/>
               <w:right w:val="nil"/>
             </w:tcBorders>
+            <w:shd w:val="clear" w:color="auto" w:fill="FFFFFF"/>
           </w:tcPr>
           <w:p>
             <w:r/>
@@ -1905,6 +1963,7 @@
               <w:bottom w:val="single" w:sz="12" w:space="0" w:color="000000"/>
               <w:right w:val="nil"/>
             </w:tcBorders>
+            <w:shd w:val="clear" w:color="auto" w:fill="FFFFFF"/>
           </w:tcPr>
           <w:p>
             <w:r/>
@@ -1922,6 +1981,7 @@
               <w:bottom w:val="single" w:sz="12" w:space="0" w:color="000000"/>
               <w:right w:val="nil"/>
             </w:tcBorders>
+            <w:shd w:val="clear" w:color="auto" w:fill="FFFFFF"/>
           </w:tcPr>
           <w:p>
             <w:r/>
@@ -1939,6 +1999,7 @@
               <w:bottom w:val="single" w:sz="12" w:space="0" w:color="000000"/>
               <w:right w:val="nil"/>
             </w:tcBorders>
+            <w:shd w:val="clear" w:color="auto" w:fill="FFFFFF"/>
           </w:tcPr>
           <w:p>
             <w:r/>
@@ -1956,6 +2017,7 @@
               <w:bottom w:val="single" w:sz="12" w:space="0" w:color="000000"/>
               <w:right w:val="nil"/>
             </w:tcBorders>
+            <w:shd w:val="clear" w:color="auto" w:fill="FFFFFF"/>
           </w:tcPr>
           <w:p>
             <w:r/>
@@ -2905,9 +2967,8 @@
     </w:p>
     <w:tbl>
       <w:tblPr>
-        <w:tblStyle w:val="LightGrid-Accent1"/>
         <w:tblW w:type="auto" w:w="0"/>
-        <w:tblLook w:firstColumn="1" w:firstRow="1" w:lastColumn="0" w:lastRow="0" w:noHBand="0" w:noVBand="1" w:val="04A0"/>
+        <w:tblLook w:firstColumn="0" w:firstRow="0" w:lastColumn="0" w:lastRow="0" w:noHBand="1" w:noVBand="1" w:val="04A0"/>
         <w:tblBorders>
           <w:top w:val="nil"/>
           <w:left w:val="nil"/>
@@ -2936,6 +2997,7 @@
               <w:bottom w:val="single" w:sz="6" w:space="0" w:color="000000"/>
               <w:right w:val="nil"/>
             </w:tcBorders>
+            <w:shd w:val="clear" w:color="auto" w:fill="FFFFFF"/>
           </w:tcPr>
           <w:p>
             <w:r/>
@@ -2958,6 +3020,7 @@
               <w:bottom w:val="single" w:sz="6" w:space="0" w:color="000000"/>
               <w:right w:val="nil"/>
             </w:tcBorders>
+            <w:shd w:val="clear" w:color="auto" w:fill="FFFFFF"/>
           </w:tcPr>
           <w:p>
             <w:r/>
@@ -2980,6 +3043,7 @@
               <w:bottom w:val="single" w:sz="6" w:space="0" w:color="000000"/>
               <w:right w:val="nil"/>
             </w:tcBorders>
+            <w:shd w:val="clear" w:color="auto" w:fill="FFFFFF"/>
           </w:tcPr>
           <w:p>
             <w:r/>
@@ -3002,6 +3066,7 @@
               <w:bottom w:val="single" w:sz="6" w:space="0" w:color="000000"/>
               <w:right w:val="nil"/>
             </w:tcBorders>
+            <w:shd w:val="clear" w:color="auto" w:fill="FFFFFF"/>
           </w:tcPr>
           <w:p>
             <w:r/>
@@ -3024,6 +3089,7 @@
               <w:bottom w:val="single" w:sz="6" w:space="0" w:color="000000"/>
               <w:right w:val="nil"/>
             </w:tcBorders>
+            <w:shd w:val="clear" w:color="auto" w:fill="FFFFFF"/>
           </w:tcPr>
           <w:p>
             <w:r/>
@@ -3046,6 +3112,7 @@
               <w:bottom w:val="single" w:sz="6" w:space="0" w:color="000000"/>
               <w:right w:val="nil"/>
             </w:tcBorders>
+            <w:shd w:val="clear" w:color="auto" w:fill="FFFFFF"/>
           </w:tcPr>
           <w:p>
             <w:r/>
@@ -3068,6 +3135,7 @@
               <w:bottom w:val="single" w:sz="6" w:space="0" w:color="000000"/>
               <w:right w:val="nil"/>
             </w:tcBorders>
+            <w:shd w:val="clear" w:color="auto" w:fill="FFFFFF"/>
           </w:tcPr>
           <w:p>
             <w:r/>
@@ -3092,6 +3160,7 @@
               <w:bottom w:val="nil"/>
               <w:right w:val="nil"/>
             </w:tcBorders>
+            <w:shd w:val="clear" w:color="auto" w:fill="FFFFFF"/>
           </w:tcPr>
           <w:p>
             <w:r/>
@@ -3113,6 +3182,7 @@
               <w:bottom w:val="nil"/>
               <w:right w:val="nil"/>
             </w:tcBorders>
+            <w:shd w:val="clear" w:color="auto" w:fill="FFFFFF"/>
           </w:tcPr>
           <w:p>
             <w:r/>
@@ -3134,6 +3204,7 @@
               <w:bottom w:val="nil"/>
               <w:right w:val="nil"/>
             </w:tcBorders>
+            <w:shd w:val="clear" w:color="auto" w:fill="FFFFFF"/>
           </w:tcPr>
           <w:p>
             <w:r/>
@@ -3155,6 +3226,7 @@
               <w:bottom w:val="nil"/>
               <w:right w:val="nil"/>
             </w:tcBorders>
+            <w:shd w:val="clear" w:color="auto" w:fill="FFFFFF"/>
           </w:tcPr>
           <w:p>
             <w:r/>
@@ -3176,6 +3248,7 @@
               <w:bottom w:val="nil"/>
               <w:right w:val="nil"/>
             </w:tcBorders>
+            <w:shd w:val="clear" w:color="auto" w:fill="FFFFFF"/>
           </w:tcPr>
           <w:p>
             <w:r/>
@@ -3197,6 +3270,7 @@
               <w:bottom w:val="nil"/>
               <w:right w:val="nil"/>
             </w:tcBorders>
+            <w:shd w:val="clear" w:color="auto" w:fill="FFFFFF"/>
           </w:tcPr>
           <w:p>
             <w:r/>
@@ -3218,6 +3292,7 @@
               <w:bottom w:val="nil"/>
               <w:right w:val="nil"/>
             </w:tcBorders>
+            <w:shd w:val="clear" w:color="auto" w:fill="FFFFFF"/>
           </w:tcPr>
           <w:p>
             <w:r/>
@@ -3241,6 +3316,7 @@
               <w:bottom w:val="nil"/>
               <w:right w:val="nil"/>
             </w:tcBorders>
+            <w:shd w:val="clear" w:color="auto" w:fill="FFFFFF"/>
           </w:tcPr>
           <w:p>
             <w:r/>
@@ -3262,6 +3338,7 @@
               <w:bottom w:val="nil"/>
               <w:right w:val="nil"/>
             </w:tcBorders>
+            <w:shd w:val="clear" w:color="auto" w:fill="FFFFFF"/>
           </w:tcPr>
           <w:p>
             <w:r/>
@@ -3283,6 +3360,7 @@
               <w:bottom w:val="nil"/>
               <w:right w:val="nil"/>
             </w:tcBorders>
+            <w:shd w:val="clear" w:color="auto" w:fill="FFFFFF"/>
           </w:tcPr>
           <w:p>
             <w:r/>
@@ -3304,6 +3382,7 @@
               <w:bottom w:val="nil"/>
               <w:right w:val="nil"/>
             </w:tcBorders>
+            <w:shd w:val="clear" w:color="auto" w:fill="FFFFFF"/>
           </w:tcPr>
           <w:p>
             <w:r/>
@@ -3325,6 +3404,7 @@
               <w:bottom w:val="nil"/>
               <w:right w:val="nil"/>
             </w:tcBorders>
+            <w:shd w:val="clear" w:color="auto" w:fill="FFFFFF"/>
           </w:tcPr>
           <w:p>
             <w:r/>
@@ -3346,6 +3426,7 @@
               <w:bottom w:val="nil"/>
               <w:right w:val="nil"/>
             </w:tcBorders>
+            <w:shd w:val="clear" w:color="auto" w:fill="FFFFFF"/>
           </w:tcPr>
           <w:p>
             <w:r/>
@@ -3367,6 +3448,7 @@
               <w:bottom w:val="nil"/>
               <w:right w:val="nil"/>
             </w:tcBorders>
+            <w:shd w:val="clear" w:color="auto" w:fill="FFFFFF"/>
           </w:tcPr>
           <w:p>
             <w:r/>
@@ -3390,6 +3472,7 @@
               <w:bottom w:val="nil"/>
               <w:right w:val="nil"/>
             </w:tcBorders>
+            <w:shd w:val="clear" w:color="auto" w:fill="FFFFFF"/>
           </w:tcPr>
           <w:p>
             <w:r/>
@@ -3411,6 +3494,7 @@
               <w:bottom w:val="nil"/>
               <w:right w:val="nil"/>
             </w:tcBorders>
+            <w:shd w:val="clear" w:color="auto" w:fill="FFFFFF"/>
           </w:tcPr>
           <w:p>
             <w:r/>
@@ -3432,6 +3516,7 @@
               <w:bottom w:val="nil"/>
               <w:right w:val="nil"/>
             </w:tcBorders>
+            <w:shd w:val="clear" w:color="auto" w:fill="FFFFFF"/>
           </w:tcPr>
           <w:p>
             <w:r/>
@@ -3453,6 +3538,7 @@
               <w:bottom w:val="nil"/>
               <w:right w:val="nil"/>
             </w:tcBorders>
+            <w:shd w:val="clear" w:color="auto" w:fill="FFFFFF"/>
           </w:tcPr>
           <w:p>
             <w:r/>
@@ -3474,6 +3560,7 @@
               <w:bottom w:val="nil"/>
               <w:right w:val="nil"/>
             </w:tcBorders>
+            <w:shd w:val="clear" w:color="auto" w:fill="FFFFFF"/>
           </w:tcPr>
           <w:p>
             <w:r/>
@@ -3495,6 +3582,7 @@
               <w:bottom w:val="nil"/>
               <w:right w:val="nil"/>
             </w:tcBorders>
+            <w:shd w:val="clear" w:color="auto" w:fill="FFFFFF"/>
           </w:tcPr>
           <w:p>
             <w:r/>
@@ -3516,6 +3604,7 @@
               <w:bottom w:val="nil"/>
               <w:right w:val="nil"/>
             </w:tcBorders>
+            <w:shd w:val="clear" w:color="auto" w:fill="FFFFFF"/>
           </w:tcPr>
           <w:p>
             <w:r/>
@@ -3539,6 +3628,7 @@
               <w:bottom w:val="nil"/>
               <w:right w:val="nil"/>
             </w:tcBorders>
+            <w:shd w:val="clear" w:color="auto" w:fill="FFFFFF"/>
           </w:tcPr>
           <w:p>
             <w:r/>
@@ -3560,6 +3650,7 @@
               <w:bottom w:val="nil"/>
               <w:right w:val="nil"/>
             </w:tcBorders>
+            <w:shd w:val="clear" w:color="auto" w:fill="FFFFFF"/>
           </w:tcPr>
           <w:p>
             <w:r/>
@@ -3581,6 +3672,7 @@
               <w:bottom w:val="nil"/>
               <w:right w:val="nil"/>
             </w:tcBorders>
+            <w:shd w:val="clear" w:color="auto" w:fill="FFFFFF"/>
           </w:tcPr>
           <w:p>
             <w:r/>
@@ -3602,6 +3694,7 @@
               <w:bottom w:val="nil"/>
               <w:right w:val="nil"/>
             </w:tcBorders>
+            <w:shd w:val="clear" w:color="auto" w:fill="FFFFFF"/>
           </w:tcPr>
           <w:p>
             <w:r/>
@@ -3623,6 +3716,7 @@
               <w:bottom w:val="nil"/>
               <w:right w:val="nil"/>
             </w:tcBorders>
+            <w:shd w:val="clear" w:color="auto" w:fill="FFFFFF"/>
           </w:tcPr>
           <w:p>
             <w:r/>
@@ -3644,6 +3738,7 @@
               <w:bottom w:val="nil"/>
               <w:right w:val="nil"/>
             </w:tcBorders>
+            <w:shd w:val="clear" w:color="auto" w:fill="FFFFFF"/>
           </w:tcPr>
           <w:p>
             <w:r/>
@@ -3661,6 +3756,7 @@
               <w:bottom w:val="nil"/>
               <w:right w:val="nil"/>
             </w:tcBorders>
+            <w:shd w:val="clear" w:color="auto" w:fill="FFFFFF"/>
           </w:tcPr>
           <w:p>
             <w:r/>
@@ -3684,6 +3780,7 @@
               <w:bottom w:val="nil"/>
               <w:right w:val="nil"/>
             </w:tcBorders>
+            <w:shd w:val="clear" w:color="auto" w:fill="FFFFFF"/>
           </w:tcPr>
           <w:p>
             <w:r/>
@@ -3705,6 +3802,7 @@
               <w:bottom w:val="nil"/>
               <w:right w:val="nil"/>
             </w:tcBorders>
+            <w:shd w:val="clear" w:color="auto" w:fill="FFFFFF"/>
           </w:tcPr>
           <w:p>
             <w:r/>
@@ -3726,6 +3824,7 @@
               <w:bottom w:val="nil"/>
               <w:right w:val="nil"/>
             </w:tcBorders>
+            <w:shd w:val="clear" w:color="auto" w:fill="FFFFFF"/>
           </w:tcPr>
           <w:p>
             <w:r/>
@@ -3747,6 +3846,7 @@
               <w:bottom w:val="nil"/>
               <w:right w:val="nil"/>
             </w:tcBorders>
+            <w:shd w:val="clear" w:color="auto" w:fill="FFFFFF"/>
           </w:tcPr>
           <w:p>
             <w:r/>
@@ -3768,6 +3868,7 @@
               <w:bottom w:val="nil"/>
               <w:right w:val="nil"/>
             </w:tcBorders>
+            <w:shd w:val="clear" w:color="auto" w:fill="FFFFFF"/>
           </w:tcPr>
           <w:p>
             <w:r/>
@@ -3789,6 +3890,7 @@
               <w:bottom w:val="nil"/>
               <w:right w:val="nil"/>
             </w:tcBorders>
+            <w:shd w:val="clear" w:color="auto" w:fill="FFFFFF"/>
           </w:tcPr>
           <w:p>
             <w:r/>
@@ -3810,6 +3912,7 @@
               <w:bottom w:val="nil"/>
               <w:right w:val="nil"/>
             </w:tcBorders>
+            <w:shd w:val="clear" w:color="auto" w:fill="FFFFFF"/>
           </w:tcPr>
           <w:p>
             <w:r/>
@@ -3833,6 +3936,7 @@
               <w:bottom w:val="nil"/>
               <w:right w:val="nil"/>
             </w:tcBorders>
+            <w:shd w:val="clear" w:color="auto" w:fill="FFFFFF"/>
           </w:tcPr>
           <w:p>
             <w:r/>
@@ -3854,6 +3958,7 @@
               <w:bottom w:val="nil"/>
               <w:right w:val="nil"/>
             </w:tcBorders>
+            <w:shd w:val="clear" w:color="auto" w:fill="FFFFFF"/>
           </w:tcPr>
           <w:p>
             <w:r/>
@@ -3875,6 +3980,7 @@
               <w:bottom w:val="nil"/>
               <w:right w:val="nil"/>
             </w:tcBorders>
+            <w:shd w:val="clear" w:color="auto" w:fill="FFFFFF"/>
           </w:tcPr>
           <w:p>
             <w:r/>
@@ -3896,6 +4002,7 @@
               <w:bottom w:val="nil"/>
               <w:right w:val="nil"/>
             </w:tcBorders>
+            <w:shd w:val="clear" w:color="auto" w:fill="FFFFFF"/>
           </w:tcPr>
           <w:p>
             <w:r/>
@@ -3917,6 +4024,7 @@
               <w:bottom w:val="nil"/>
               <w:right w:val="nil"/>
             </w:tcBorders>
+            <w:shd w:val="clear" w:color="auto" w:fill="FFFFFF"/>
           </w:tcPr>
           <w:p>
             <w:r/>
@@ -3938,6 +4046,7 @@
               <w:bottom w:val="nil"/>
               <w:right w:val="nil"/>
             </w:tcBorders>
+            <w:shd w:val="clear" w:color="auto" w:fill="FFFFFF"/>
           </w:tcPr>
           <w:p>
             <w:r/>
@@ -3959,6 +4068,7 @@
               <w:bottom w:val="nil"/>
               <w:right w:val="nil"/>
             </w:tcBorders>
+            <w:shd w:val="clear" w:color="auto" w:fill="FFFFFF"/>
           </w:tcPr>
           <w:p>
             <w:r/>
@@ -3982,6 +4092,7 @@
               <w:bottom w:val="nil"/>
               <w:right w:val="nil"/>
             </w:tcBorders>
+            <w:shd w:val="clear" w:color="auto" w:fill="FFFFFF"/>
           </w:tcPr>
           <w:p>
             <w:r/>
@@ -4003,6 +4114,7 @@
               <w:bottom w:val="nil"/>
               <w:right w:val="nil"/>
             </w:tcBorders>
+            <w:shd w:val="clear" w:color="auto" w:fill="FFFFFF"/>
           </w:tcPr>
           <w:p>
             <w:r/>
@@ -4024,6 +4136,7 @@
               <w:bottom w:val="nil"/>
               <w:right w:val="nil"/>
             </w:tcBorders>
+            <w:shd w:val="clear" w:color="auto" w:fill="FFFFFF"/>
           </w:tcPr>
           <w:p>
             <w:r/>
@@ -4045,6 +4158,7 @@
               <w:bottom w:val="nil"/>
               <w:right w:val="nil"/>
             </w:tcBorders>
+            <w:shd w:val="clear" w:color="auto" w:fill="FFFFFF"/>
           </w:tcPr>
           <w:p>
             <w:r/>
@@ -4066,6 +4180,7 @@
               <w:bottom w:val="nil"/>
               <w:right w:val="nil"/>
             </w:tcBorders>
+            <w:shd w:val="clear" w:color="auto" w:fill="FFFFFF"/>
           </w:tcPr>
           <w:p>
             <w:r/>
@@ -4087,6 +4202,7 @@
               <w:bottom w:val="nil"/>
               <w:right w:val="nil"/>
             </w:tcBorders>
+            <w:shd w:val="clear" w:color="auto" w:fill="FFFFFF"/>
           </w:tcPr>
           <w:p>
             <w:r/>
@@ -4108,6 +4224,7 @@
               <w:bottom w:val="nil"/>
               <w:right w:val="nil"/>
             </w:tcBorders>
+            <w:shd w:val="clear" w:color="auto" w:fill="FFFFFF"/>
           </w:tcPr>
           <w:p>
             <w:r/>
@@ -4131,6 +4248,7 @@
               <w:bottom w:val="nil"/>
               <w:right w:val="nil"/>
             </w:tcBorders>
+            <w:shd w:val="clear" w:color="auto" w:fill="FFFFFF"/>
           </w:tcPr>
           <w:p>
             <w:r/>
@@ -4152,6 +4270,7 @@
               <w:bottom w:val="nil"/>
               <w:right w:val="nil"/>
             </w:tcBorders>
+            <w:shd w:val="clear" w:color="auto" w:fill="FFFFFF"/>
           </w:tcPr>
           <w:p>
             <w:r/>
@@ -4173,6 +4292,7 @@
               <w:bottom w:val="nil"/>
               <w:right w:val="nil"/>
             </w:tcBorders>
+            <w:shd w:val="clear" w:color="auto" w:fill="FFFFFF"/>
           </w:tcPr>
           <w:p>
             <w:r/>
@@ -4194,6 +4314,7 @@
               <w:bottom w:val="nil"/>
               <w:right w:val="nil"/>
             </w:tcBorders>
+            <w:shd w:val="clear" w:color="auto" w:fill="FFFFFF"/>
           </w:tcPr>
           <w:p>
             <w:r/>
@@ -4215,6 +4336,7 @@
               <w:bottom w:val="nil"/>
               <w:right w:val="nil"/>
             </w:tcBorders>
+            <w:shd w:val="clear" w:color="auto" w:fill="FFFFFF"/>
           </w:tcPr>
           <w:p>
             <w:r/>
@@ -4236,6 +4358,7 @@
               <w:bottom w:val="nil"/>
               <w:right w:val="nil"/>
             </w:tcBorders>
+            <w:shd w:val="clear" w:color="auto" w:fill="FFFFFF"/>
           </w:tcPr>
           <w:p>
             <w:r/>
@@ -4257,6 +4380,7 @@
               <w:bottom w:val="nil"/>
               <w:right w:val="nil"/>
             </w:tcBorders>
+            <w:shd w:val="clear" w:color="auto" w:fill="FFFFFF"/>
           </w:tcPr>
           <w:p>
             <w:r/>
@@ -4280,6 +4404,7 @@
               <w:bottom w:val="nil"/>
               <w:right w:val="nil"/>
             </w:tcBorders>
+            <w:shd w:val="clear" w:color="auto" w:fill="FFFFFF"/>
           </w:tcPr>
           <w:p>
             <w:r/>
@@ -4301,6 +4426,7 @@
               <w:bottom w:val="nil"/>
               <w:right w:val="nil"/>
             </w:tcBorders>
+            <w:shd w:val="clear" w:color="auto" w:fill="FFFFFF"/>
           </w:tcPr>
           <w:p>
             <w:r/>
@@ -4322,6 +4448,7 @@
               <w:bottom w:val="nil"/>
               <w:right w:val="nil"/>
             </w:tcBorders>
+            <w:shd w:val="clear" w:color="auto" w:fill="FFFFFF"/>
           </w:tcPr>
           <w:p>
             <w:r/>
@@ -4343,6 +4470,7 @@
               <w:bottom w:val="nil"/>
               <w:right w:val="nil"/>
             </w:tcBorders>
+            <w:shd w:val="clear" w:color="auto" w:fill="FFFFFF"/>
           </w:tcPr>
           <w:p>
             <w:r/>
@@ -4364,6 +4492,7 @@
               <w:bottom w:val="nil"/>
               <w:right w:val="nil"/>
             </w:tcBorders>
+            <w:shd w:val="clear" w:color="auto" w:fill="FFFFFF"/>
           </w:tcPr>
           <w:p>
             <w:r/>
@@ -4385,6 +4514,7 @@
               <w:bottom w:val="nil"/>
               <w:right w:val="nil"/>
             </w:tcBorders>
+            <w:shd w:val="clear" w:color="auto" w:fill="FFFFFF"/>
           </w:tcPr>
           <w:p>
             <w:r/>
@@ -4406,6 +4536,7 @@
               <w:bottom w:val="nil"/>
               <w:right w:val="nil"/>
             </w:tcBorders>
+            <w:shd w:val="clear" w:color="auto" w:fill="FFFFFF"/>
           </w:tcPr>
           <w:p>
             <w:r/>
@@ -4429,6 +4560,7 @@
               <w:bottom w:val="nil"/>
               <w:right w:val="nil"/>
             </w:tcBorders>
+            <w:shd w:val="clear" w:color="auto" w:fill="FFFFFF"/>
           </w:tcPr>
           <w:p>
             <w:r/>
@@ -4450,6 +4582,7 @@
               <w:bottom w:val="nil"/>
               <w:right w:val="nil"/>
             </w:tcBorders>
+            <w:shd w:val="clear" w:color="auto" w:fill="FFFFFF"/>
           </w:tcPr>
           <w:p>
             <w:r/>
@@ -4471,6 +4604,7 @@
               <w:bottom w:val="nil"/>
               <w:right w:val="nil"/>
             </w:tcBorders>
+            <w:shd w:val="clear" w:color="auto" w:fill="FFFFFF"/>
           </w:tcPr>
           <w:p>
             <w:r/>
@@ -4492,6 +4626,7 @@
               <w:bottom w:val="nil"/>
               <w:right w:val="nil"/>
             </w:tcBorders>
+            <w:shd w:val="clear" w:color="auto" w:fill="FFFFFF"/>
           </w:tcPr>
           <w:p>
             <w:r/>
@@ -4513,6 +4648,7 @@
               <w:bottom w:val="nil"/>
               <w:right w:val="nil"/>
             </w:tcBorders>
+            <w:shd w:val="clear" w:color="auto" w:fill="FFFFFF"/>
           </w:tcPr>
           <w:p>
             <w:r/>
@@ -4534,6 +4670,7 @@
               <w:bottom w:val="nil"/>
               <w:right w:val="nil"/>
             </w:tcBorders>
+            <w:shd w:val="clear" w:color="auto" w:fill="FFFFFF"/>
           </w:tcPr>
           <w:p>
             <w:r/>
@@ -4555,6 +4692,7 @@
               <w:bottom w:val="nil"/>
               <w:right w:val="nil"/>
             </w:tcBorders>
+            <w:shd w:val="clear" w:color="auto" w:fill="FFFFFF"/>
           </w:tcPr>
           <w:p>
             <w:r/>
@@ -4578,6 +4716,7 @@
               <w:bottom w:val="nil"/>
               <w:right w:val="nil"/>
             </w:tcBorders>
+            <w:shd w:val="clear" w:color="auto" w:fill="FFFFFF"/>
           </w:tcPr>
           <w:p>
             <w:r/>
@@ -4599,6 +4738,7 @@
               <w:bottom w:val="nil"/>
               <w:right w:val="nil"/>
             </w:tcBorders>
+            <w:shd w:val="clear" w:color="auto" w:fill="FFFFFF"/>
           </w:tcPr>
           <w:p>
             <w:r/>
@@ -4620,6 +4760,7 @@
               <w:bottom w:val="nil"/>
               <w:right w:val="nil"/>
             </w:tcBorders>
+            <w:shd w:val="clear" w:color="auto" w:fill="FFFFFF"/>
           </w:tcPr>
           <w:p>
             <w:r/>
@@ -4641,6 +4782,7 @@
               <w:bottom w:val="nil"/>
               <w:right w:val="nil"/>
             </w:tcBorders>
+            <w:shd w:val="clear" w:color="auto" w:fill="FFFFFF"/>
           </w:tcPr>
           <w:p>
             <w:r/>
@@ -4662,6 +4804,7 @@
               <w:bottom w:val="nil"/>
               <w:right w:val="nil"/>
             </w:tcBorders>
+            <w:shd w:val="clear" w:color="auto" w:fill="FFFFFF"/>
           </w:tcPr>
           <w:p>
             <w:r/>
@@ -4683,6 +4826,7 @@
               <w:bottom w:val="nil"/>
               <w:right w:val="nil"/>
             </w:tcBorders>
+            <w:shd w:val="clear" w:color="auto" w:fill="FFFFFF"/>
           </w:tcPr>
           <w:p>
             <w:r/>
@@ -4704,6 +4848,7 @@
               <w:bottom w:val="nil"/>
               <w:right w:val="nil"/>
             </w:tcBorders>
+            <w:shd w:val="clear" w:color="auto" w:fill="FFFFFF"/>
           </w:tcPr>
           <w:p>
             <w:r/>
@@ -4727,6 +4872,7 @@
               <w:bottom w:val="nil"/>
               <w:right w:val="nil"/>
             </w:tcBorders>
+            <w:shd w:val="clear" w:color="auto" w:fill="FFFFFF"/>
           </w:tcPr>
           <w:p>
             <w:r/>
@@ -4748,6 +4894,7 @@
               <w:bottom w:val="nil"/>
               <w:right w:val="nil"/>
             </w:tcBorders>
+            <w:shd w:val="clear" w:color="auto" w:fill="FFFFFF"/>
           </w:tcPr>
           <w:p>
             <w:r/>
@@ -4769,6 +4916,7 @@
               <w:bottom w:val="nil"/>
               <w:right w:val="nil"/>
             </w:tcBorders>
+            <w:shd w:val="clear" w:color="auto" w:fill="FFFFFF"/>
           </w:tcPr>
           <w:p>
             <w:r/>
@@ -4790,6 +4938,7 @@
               <w:bottom w:val="nil"/>
               <w:right w:val="nil"/>
             </w:tcBorders>
+            <w:shd w:val="clear" w:color="auto" w:fill="FFFFFF"/>
           </w:tcPr>
           <w:p>
             <w:r/>
@@ -4811,6 +4960,7 @@
               <w:bottom w:val="nil"/>
               <w:right w:val="nil"/>
             </w:tcBorders>
+            <w:shd w:val="clear" w:color="auto" w:fill="FFFFFF"/>
           </w:tcPr>
           <w:p>
             <w:r/>
@@ -4832,6 +4982,7 @@
               <w:bottom w:val="nil"/>
               <w:right w:val="nil"/>
             </w:tcBorders>
+            <w:shd w:val="clear" w:color="auto" w:fill="FFFFFF"/>
           </w:tcPr>
           <w:p>
             <w:r/>
@@ -4853,6 +5004,7 @@
               <w:bottom w:val="nil"/>
               <w:right w:val="nil"/>
             </w:tcBorders>
+            <w:shd w:val="clear" w:color="auto" w:fill="FFFFFF"/>
           </w:tcPr>
           <w:p>
             <w:r/>
@@ -4876,6 +5028,7 @@
               <w:bottom w:val="nil"/>
               <w:right w:val="nil"/>
             </w:tcBorders>
+            <w:shd w:val="clear" w:color="auto" w:fill="FFFFFF"/>
           </w:tcPr>
           <w:p>
             <w:r/>
@@ -4897,6 +5050,7 @@
               <w:bottom w:val="nil"/>
               <w:right w:val="nil"/>
             </w:tcBorders>
+            <w:shd w:val="clear" w:color="auto" w:fill="FFFFFF"/>
           </w:tcPr>
           <w:p>
             <w:r/>
@@ -4918,6 +5072,7 @@
               <w:bottom w:val="nil"/>
               <w:right w:val="nil"/>
             </w:tcBorders>
+            <w:shd w:val="clear" w:color="auto" w:fill="FFFFFF"/>
           </w:tcPr>
           <w:p>
             <w:r/>
@@ -4939,6 +5094,7 @@
               <w:bottom w:val="nil"/>
               <w:right w:val="nil"/>
             </w:tcBorders>
+            <w:shd w:val="clear" w:color="auto" w:fill="FFFFFF"/>
           </w:tcPr>
           <w:p>
             <w:r/>
@@ -4960,6 +5116,7 @@
               <w:bottom w:val="nil"/>
               <w:right w:val="nil"/>
             </w:tcBorders>
+            <w:shd w:val="clear" w:color="auto" w:fill="FFFFFF"/>
           </w:tcPr>
           <w:p>
             <w:r/>
@@ -4981,6 +5138,7 @@
               <w:bottom w:val="nil"/>
               <w:right w:val="nil"/>
             </w:tcBorders>
+            <w:shd w:val="clear" w:color="auto" w:fill="FFFFFF"/>
           </w:tcPr>
           <w:p>
             <w:r/>
@@ -5002,6 +5160,7 @@
               <w:bottom w:val="nil"/>
               <w:right w:val="nil"/>
             </w:tcBorders>
+            <w:shd w:val="clear" w:color="auto" w:fill="FFFFFF"/>
           </w:tcPr>
           <w:p>
             <w:r/>
@@ -5025,6 +5184,7 @@
               <w:bottom w:val="nil"/>
               <w:right w:val="nil"/>
             </w:tcBorders>
+            <w:shd w:val="clear" w:color="auto" w:fill="FFFFFF"/>
           </w:tcPr>
           <w:p>
             <w:r/>
@@ -5046,6 +5206,7 @@
               <w:bottom w:val="nil"/>
               <w:right w:val="nil"/>
             </w:tcBorders>
+            <w:shd w:val="clear" w:color="auto" w:fill="FFFFFF"/>
           </w:tcPr>
           <w:p>
             <w:r/>
@@ -5067,6 +5228,7 @@
               <w:bottom w:val="nil"/>
               <w:right w:val="nil"/>
             </w:tcBorders>
+            <w:shd w:val="clear" w:color="auto" w:fill="FFFFFF"/>
           </w:tcPr>
           <w:p>
             <w:r/>
@@ -5088,6 +5250,7 @@
               <w:bottom w:val="nil"/>
               <w:right w:val="nil"/>
             </w:tcBorders>
+            <w:shd w:val="clear" w:color="auto" w:fill="FFFFFF"/>
           </w:tcPr>
           <w:p>
             <w:r/>
@@ -5109,6 +5272,7 @@
               <w:bottom w:val="nil"/>
               <w:right w:val="nil"/>
             </w:tcBorders>
+            <w:shd w:val="clear" w:color="auto" w:fill="FFFFFF"/>
           </w:tcPr>
           <w:p>
             <w:r/>
@@ -5130,6 +5294,7 @@
               <w:bottom w:val="nil"/>
               <w:right w:val="nil"/>
             </w:tcBorders>
+            <w:shd w:val="clear" w:color="auto" w:fill="FFFFFF"/>
           </w:tcPr>
           <w:p>
             <w:r/>
@@ -5151,6 +5316,7 @@
               <w:bottom w:val="nil"/>
               <w:right w:val="nil"/>
             </w:tcBorders>
+            <w:shd w:val="clear" w:color="auto" w:fill="FFFFFF"/>
           </w:tcPr>
           <w:p>
             <w:r/>
@@ -5174,6 +5340,7 @@
               <w:bottom w:val="nil"/>
               <w:right w:val="nil"/>
             </w:tcBorders>
+            <w:shd w:val="clear" w:color="auto" w:fill="FFFFFF"/>
           </w:tcPr>
           <w:p>
             <w:r/>
@@ -5195,6 +5362,7 @@
               <w:bottom w:val="nil"/>
               <w:right w:val="nil"/>
             </w:tcBorders>
+            <w:shd w:val="clear" w:color="auto" w:fill="FFFFFF"/>
           </w:tcPr>
           <w:p>
             <w:r/>
@@ -5216,6 +5384,7 @@
               <w:bottom w:val="nil"/>
               <w:right w:val="nil"/>
             </w:tcBorders>
+            <w:shd w:val="clear" w:color="auto" w:fill="FFFFFF"/>
           </w:tcPr>
           <w:p>
             <w:r/>
@@ -5237,6 +5406,7 @@
               <w:bottom w:val="nil"/>
               <w:right w:val="nil"/>
             </w:tcBorders>
+            <w:shd w:val="clear" w:color="auto" w:fill="FFFFFF"/>
           </w:tcPr>
           <w:p>
             <w:r/>
@@ -5258,6 +5428,7 @@
               <w:bottom w:val="nil"/>
               <w:right w:val="nil"/>
             </w:tcBorders>
+            <w:shd w:val="clear" w:color="auto" w:fill="FFFFFF"/>
           </w:tcPr>
           <w:p>
             <w:r/>
@@ -5279,6 +5450,7 @@
               <w:bottom w:val="nil"/>
               <w:right w:val="nil"/>
             </w:tcBorders>
+            <w:shd w:val="clear" w:color="auto" w:fill="FFFFFF"/>
           </w:tcPr>
           <w:p>
             <w:r/>
@@ -5300,6 +5472,7 @@
               <w:bottom w:val="nil"/>
               <w:right w:val="nil"/>
             </w:tcBorders>
+            <w:shd w:val="clear" w:color="auto" w:fill="FFFFFF"/>
           </w:tcPr>
           <w:p>
             <w:r/>
@@ -5323,6 +5496,7 @@
               <w:bottom w:val="nil"/>
               <w:right w:val="nil"/>
             </w:tcBorders>
+            <w:shd w:val="clear" w:color="auto" w:fill="FFFFFF"/>
           </w:tcPr>
           <w:p>
             <w:r/>
@@ -5344,6 +5518,7 @@
               <w:bottom w:val="nil"/>
               <w:right w:val="nil"/>
             </w:tcBorders>
+            <w:shd w:val="clear" w:color="auto" w:fill="FFFFFF"/>
           </w:tcPr>
           <w:p>
             <w:r/>
@@ -5365,6 +5540,7 @@
               <w:bottom w:val="nil"/>
               <w:right w:val="nil"/>
             </w:tcBorders>
+            <w:shd w:val="clear" w:color="auto" w:fill="FFFFFF"/>
           </w:tcPr>
           <w:p>
             <w:r/>
@@ -5386,6 +5562,7 @@
               <w:bottom w:val="nil"/>
               <w:right w:val="nil"/>
             </w:tcBorders>
+            <w:shd w:val="clear" w:color="auto" w:fill="FFFFFF"/>
           </w:tcPr>
           <w:p>
             <w:r/>
@@ -5407,6 +5584,7 @@
               <w:bottom w:val="nil"/>
               <w:right w:val="nil"/>
             </w:tcBorders>
+            <w:shd w:val="clear" w:color="auto" w:fill="FFFFFF"/>
           </w:tcPr>
           <w:p>
             <w:r/>
@@ -5428,6 +5606,7 @@
               <w:bottom w:val="nil"/>
               <w:right w:val="nil"/>
             </w:tcBorders>
+            <w:shd w:val="clear" w:color="auto" w:fill="FFFFFF"/>
           </w:tcPr>
           <w:p>
             <w:r/>
@@ -5449,6 +5628,7 @@
               <w:bottom w:val="nil"/>
               <w:right w:val="nil"/>
             </w:tcBorders>
+            <w:shd w:val="clear" w:color="auto" w:fill="FFFFFF"/>
           </w:tcPr>
           <w:p>
             <w:r/>
@@ -5472,6 +5652,7 @@
               <w:bottom w:val="nil"/>
               <w:right w:val="nil"/>
             </w:tcBorders>
+            <w:shd w:val="clear" w:color="auto" w:fill="FFFFFF"/>
           </w:tcPr>
           <w:p>
             <w:r/>
@@ -5493,6 +5674,7 @@
               <w:bottom w:val="nil"/>
               <w:right w:val="nil"/>
             </w:tcBorders>
+            <w:shd w:val="clear" w:color="auto" w:fill="FFFFFF"/>
           </w:tcPr>
           <w:p>
             <w:r/>
@@ -5514,6 +5696,7 @@
               <w:bottom w:val="nil"/>
               <w:right w:val="nil"/>
             </w:tcBorders>
+            <w:shd w:val="clear" w:color="auto" w:fill="FFFFFF"/>
           </w:tcPr>
           <w:p>
             <w:r/>
@@ -5535,6 +5718,7 @@
               <w:bottom w:val="nil"/>
               <w:right w:val="nil"/>
             </w:tcBorders>
+            <w:shd w:val="clear" w:color="auto" w:fill="FFFFFF"/>
           </w:tcPr>
           <w:p>
             <w:r/>
@@ -5556,6 +5740,7 @@
               <w:bottom w:val="nil"/>
               <w:right w:val="nil"/>
             </w:tcBorders>
+            <w:shd w:val="clear" w:color="auto" w:fill="FFFFFF"/>
           </w:tcPr>
           <w:p>
             <w:r/>
@@ -5577,6 +5762,7 @@
               <w:bottom w:val="nil"/>
               <w:right w:val="nil"/>
             </w:tcBorders>
+            <w:shd w:val="clear" w:color="auto" w:fill="FFFFFF"/>
           </w:tcPr>
           <w:p>
             <w:r/>
@@ -5598,6 +5784,7 @@
               <w:bottom w:val="nil"/>
               <w:right w:val="nil"/>
             </w:tcBorders>
+            <w:shd w:val="clear" w:color="auto" w:fill="FFFFFF"/>
           </w:tcPr>
           <w:p>
             <w:r/>
@@ -5621,6 +5808,7 @@
               <w:bottom w:val="nil"/>
               <w:right w:val="nil"/>
             </w:tcBorders>
+            <w:shd w:val="clear" w:color="auto" w:fill="FFFFFF"/>
           </w:tcPr>
           <w:p>
             <w:r/>
@@ -5642,6 +5830,7 @@
               <w:bottom w:val="nil"/>
               <w:right w:val="nil"/>
             </w:tcBorders>
+            <w:shd w:val="clear" w:color="auto" w:fill="FFFFFF"/>
           </w:tcPr>
           <w:p>
             <w:r/>
@@ -5663,6 +5852,7 @@
               <w:bottom w:val="nil"/>
               <w:right w:val="nil"/>
             </w:tcBorders>
+            <w:shd w:val="clear" w:color="auto" w:fill="FFFFFF"/>
           </w:tcPr>
           <w:p>
             <w:r/>
@@ -5684,6 +5874,7 @@
               <w:bottom w:val="nil"/>
               <w:right w:val="nil"/>
             </w:tcBorders>
+            <w:shd w:val="clear" w:color="auto" w:fill="FFFFFF"/>
           </w:tcPr>
           <w:p>
             <w:r/>
@@ -5705,6 +5896,7 @@
               <w:bottom w:val="nil"/>
               <w:right w:val="nil"/>
             </w:tcBorders>
+            <w:shd w:val="clear" w:color="auto" w:fill="FFFFFF"/>
           </w:tcPr>
           <w:p>
             <w:r/>
@@ -5726,6 +5918,7 @@
               <w:bottom w:val="nil"/>
               <w:right w:val="nil"/>
             </w:tcBorders>
+            <w:shd w:val="clear" w:color="auto" w:fill="FFFFFF"/>
           </w:tcPr>
           <w:p>
             <w:r/>
@@ -5747,6 +5940,7 @@
               <w:bottom w:val="nil"/>
               <w:right w:val="nil"/>
             </w:tcBorders>
+            <w:shd w:val="clear" w:color="auto" w:fill="FFFFFF"/>
           </w:tcPr>
           <w:p>
             <w:r/>
@@ -5770,6 +5964,7 @@
               <w:bottom w:val="nil"/>
               <w:right w:val="nil"/>
             </w:tcBorders>
+            <w:shd w:val="clear" w:color="auto" w:fill="FFFFFF"/>
           </w:tcPr>
           <w:p>
             <w:r/>
@@ -5791,6 +5986,7 @@
               <w:bottom w:val="nil"/>
               <w:right w:val="nil"/>
             </w:tcBorders>
+            <w:shd w:val="clear" w:color="auto" w:fill="FFFFFF"/>
           </w:tcPr>
           <w:p>
             <w:r/>
@@ -5812,6 +6008,7 @@
               <w:bottom w:val="nil"/>
               <w:right w:val="nil"/>
             </w:tcBorders>
+            <w:shd w:val="clear" w:color="auto" w:fill="FFFFFF"/>
           </w:tcPr>
           <w:p>
             <w:r/>
@@ -5833,6 +6030,7 @@
               <w:bottom w:val="nil"/>
               <w:right w:val="nil"/>
             </w:tcBorders>
+            <w:shd w:val="clear" w:color="auto" w:fill="FFFFFF"/>
           </w:tcPr>
           <w:p>
             <w:r/>
@@ -5854,6 +6052,7 @@
               <w:bottom w:val="nil"/>
               <w:right w:val="nil"/>
             </w:tcBorders>
+            <w:shd w:val="clear" w:color="auto" w:fill="FFFFFF"/>
           </w:tcPr>
           <w:p>
             <w:r/>
@@ -5875,6 +6074,7 @@
               <w:bottom w:val="nil"/>
               <w:right w:val="nil"/>
             </w:tcBorders>
+            <w:shd w:val="clear" w:color="auto" w:fill="FFFFFF"/>
           </w:tcPr>
           <w:p>
             <w:r/>
@@ -5896,6 +6096,7 @@
               <w:bottom w:val="nil"/>
               <w:right w:val="nil"/>
             </w:tcBorders>
+            <w:shd w:val="clear" w:color="auto" w:fill="FFFFFF"/>
           </w:tcPr>
           <w:p>
             <w:r/>
@@ -5919,6 +6120,7 @@
               <w:bottom w:val="nil"/>
               <w:right w:val="nil"/>
             </w:tcBorders>
+            <w:shd w:val="clear" w:color="auto" w:fill="FFFFFF"/>
           </w:tcPr>
           <w:p>
             <w:r/>
@@ -5940,6 +6142,7 @@
               <w:bottom w:val="nil"/>
               <w:right w:val="nil"/>
             </w:tcBorders>
+            <w:shd w:val="clear" w:color="auto" w:fill="FFFFFF"/>
           </w:tcPr>
           <w:p>
             <w:r/>
@@ -5961,6 +6164,7 @@
               <w:bottom w:val="nil"/>
               <w:right w:val="nil"/>
             </w:tcBorders>
+            <w:shd w:val="clear" w:color="auto" w:fill="FFFFFF"/>
           </w:tcPr>
           <w:p>
             <w:r/>
@@ -5982,6 +6186,7 @@
               <w:bottom w:val="nil"/>
               <w:right w:val="nil"/>
             </w:tcBorders>
+            <w:shd w:val="clear" w:color="auto" w:fill="FFFFFF"/>
           </w:tcPr>
           <w:p>
             <w:r/>
@@ -6003,6 +6208,7 @@
               <w:bottom w:val="nil"/>
               <w:right w:val="nil"/>
             </w:tcBorders>
+            <w:shd w:val="clear" w:color="auto" w:fill="FFFFFF"/>
           </w:tcPr>
           <w:p>
             <w:r/>
@@ -6024,6 +6230,7 @@
               <w:bottom w:val="nil"/>
               <w:right w:val="nil"/>
             </w:tcBorders>
+            <w:shd w:val="clear" w:color="auto" w:fill="FFFFFF"/>
           </w:tcPr>
           <w:p>
             <w:r/>
@@ -6045,6 +6252,7 @@
               <w:bottom w:val="nil"/>
               <w:right w:val="nil"/>
             </w:tcBorders>
+            <w:shd w:val="clear" w:color="auto" w:fill="FFFFFF"/>
           </w:tcPr>
           <w:p>
             <w:r/>
@@ -6068,6 +6276,7 @@
               <w:bottom w:val="nil"/>
               <w:right w:val="nil"/>
             </w:tcBorders>
+            <w:shd w:val="clear" w:color="auto" w:fill="FFFFFF"/>
           </w:tcPr>
           <w:p>
             <w:r/>
@@ -6089,6 +6298,7 @@
               <w:bottom w:val="nil"/>
               <w:right w:val="nil"/>
             </w:tcBorders>
+            <w:shd w:val="clear" w:color="auto" w:fill="FFFFFF"/>
           </w:tcPr>
           <w:p>
             <w:r/>
@@ -6110,6 +6320,7 @@
               <w:bottom w:val="nil"/>
               <w:right w:val="nil"/>
             </w:tcBorders>
+            <w:shd w:val="clear" w:color="auto" w:fill="FFFFFF"/>
           </w:tcPr>
           <w:p>
             <w:r/>
@@ -6131,6 +6342,7 @@
               <w:bottom w:val="nil"/>
               <w:right w:val="nil"/>
             </w:tcBorders>
+            <w:shd w:val="clear" w:color="auto" w:fill="FFFFFF"/>
           </w:tcPr>
           <w:p>
             <w:r/>
@@ -6152,6 +6364,7 @@
               <w:bottom w:val="nil"/>
               <w:right w:val="nil"/>
             </w:tcBorders>
+            <w:shd w:val="clear" w:color="auto" w:fill="FFFFFF"/>
           </w:tcPr>
           <w:p>
             <w:r/>
@@ -6173,6 +6386,7 @@
               <w:bottom w:val="nil"/>
               <w:right w:val="nil"/>
             </w:tcBorders>
+            <w:shd w:val="clear" w:color="auto" w:fill="FFFFFF"/>
           </w:tcPr>
           <w:p>
             <w:r/>
@@ -6194,6 +6408,7 @@
               <w:bottom w:val="nil"/>
               <w:right w:val="nil"/>
             </w:tcBorders>
+            <w:shd w:val="clear" w:color="auto" w:fill="FFFFFF"/>
           </w:tcPr>
           <w:p>
             <w:r/>
@@ -6217,6 +6432,7 @@
               <w:bottom w:val="nil"/>
               <w:right w:val="nil"/>
             </w:tcBorders>
+            <w:shd w:val="clear" w:color="auto" w:fill="FFFFFF"/>
           </w:tcPr>
           <w:p>
             <w:r/>
@@ -6238,6 +6454,7 @@
               <w:bottom w:val="nil"/>
               <w:right w:val="nil"/>
             </w:tcBorders>
+            <w:shd w:val="clear" w:color="auto" w:fill="FFFFFF"/>
           </w:tcPr>
           <w:p>
             <w:r/>
@@ -6259,6 +6476,7 @@
               <w:bottom w:val="nil"/>
               <w:right w:val="nil"/>
             </w:tcBorders>
+            <w:shd w:val="clear" w:color="auto" w:fill="FFFFFF"/>
           </w:tcPr>
           <w:p>
             <w:r/>
@@ -6280,6 +6498,7 @@
               <w:bottom w:val="nil"/>
               <w:right w:val="nil"/>
             </w:tcBorders>
+            <w:shd w:val="clear" w:color="auto" w:fill="FFFFFF"/>
           </w:tcPr>
           <w:p>
             <w:r/>
@@ -6301,6 +6520,7 @@
               <w:bottom w:val="nil"/>
               <w:right w:val="nil"/>
             </w:tcBorders>
+            <w:shd w:val="clear" w:color="auto" w:fill="FFFFFF"/>
           </w:tcPr>
           <w:p>
             <w:r/>
@@ -6322,6 +6542,7 @@
               <w:bottom w:val="nil"/>
               <w:right w:val="nil"/>
             </w:tcBorders>
+            <w:shd w:val="clear" w:color="auto" w:fill="FFFFFF"/>
           </w:tcPr>
           <w:p>
             <w:r/>
@@ -6343,6 +6564,7 @@
               <w:bottom w:val="nil"/>
               <w:right w:val="nil"/>
             </w:tcBorders>
+            <w:shd w:val="clear" w:color="auto" w:fill="FFFFFF"/>
           </w:tcPr>
           <w:p>
             <w:r/>
@@ -6366,6 +6588,7 @@
               <w:bottom w:val="nil"/>
               <w:right w:val="nil"/>
             </w:tcBorders>
+            <w:shd w:val="clear" w:color="auto" w:fill="FFFFFF"/>
           </w:tcPr>
           <w:p>
             <w:r/>
@@ -6387,6 +6610,7 @@
               <w:bottom w:val="nil"/>
               <w:right w:val="nil"/>
             </w:tcBorders>
+            <w:shd w:val="clear" w:color="auto" w:fill="FFFFFF"/>
           </w:tcPr>
           <w:p>
             <w:r/>
@@ -6408,6 +6632,7 @@
               <w:bottom w:val="nil"/>
               <w:right w:val="nil"/>
             </w:tcBorders>
+            <w:shd w:val="clear" w:color="auto" w:fill="FFFFFF"/>
           </w:tcPr>
           <w:p>
             <w:r/>
@@ -6429,6 +6654,7 @@
               <w:bottom w:val="nil"/>
               <w:right w:val="nil"/>
             </w:tcBorders>
+            <w:shd w:val="clear" w:color="auto" w:fill="FFFFFF"/>
           </w:tcPr>
           <w:p>
             <w:r/>
@@ -6450,6 +6676,7 @@
               <w:bottom w:val="nil"/>
               <w:right w:val="nil"/>
             </w:tcBorders>
+            <w:shd w:val="clear" w:color="auto" w:fill="FFFFFF"/>
           </w:tcPr>
           <w:p>
             <w:r/>
@@ -6471,6 +6698,7 @@
               <w:bottom w:val="nil"/>
               <w:right w:val="nil"/>
             </w:tcBorders>
+            <w:shd w:val="clear" w:color="auto" w:fill="FFFFFF"/>
           </w:tcPr>
           <w:p>
             <w:r/>
@@ -6492,6 +6720,7 @@
               <w:bottom w:val="nil"/>
               <w:right w:val="nil"/>
             </w:tcBorders>
+            <w:shd w:val="clear" w:color="auto" w:fill="FFFFFF"/>
           </w:tcPr>
           <w:p>
             <w:r/>
@@ -6515,6 +6744,7 @@
               <w:bottom w:val="nil"/>
               <w:right w:val="nil"/>
             </w:tcBorders>
+            <w:shd w:val="clear" w:color="auto" w:fill="FFFFFF"/>
           </w:tcPr>
           <w:p>
             <w:r/>
@@ -6536,6 +6766,7 @@
               <w:bottom w:val="nil"/>
               <w:right w:val="nil"/>
             </w:tcBorders>
+            <w:shd w:val="clear" w:color="auto" w:fill="FFFFFF"/>
           </w:tcPr>
           <w:p>
             <w:r/>
@@ -6557,6 +6788,7 @@
               <w:bottom w:val="nil"/>
               <w:right w:val="nil"/>
             </w:tcBorders>
+            <w:shd w:val="clear" w:color="auto" w:fill="FFFFFF"/>
           </w:tcPr>
           <w:p>
             <w:r/>
@@ -6578,6 +6810,7 @@
               <w:bottom w:val="nil"/>
               <w:right w:val="nil"/>
             </w:tcBorders>
+            <w:shd w:val="clear" w:color="auto" w:fill="FFFFFF"/>
           </w:tcPr>
           <w:p>
             <w:r/>
@@ -6599,6 +6832,7 @@
               <w:bottom w:val="nil"/>
               <w:right w:val="nil"/>
             </w:tcBorders>
+            <w:shd w:val="clear" w:color="auto" w:fill="FFFFFF"/>
           </w:tcPr>
           <w:p>
             <w:r/>
@@ -6620,6 +6854,7 @@
               <w:bottom w:val="nil"/>
               <w:right w:val="nil"/>
             </w:tcBorders>
+            <w:shd w:val="clear" w:color="auto" w:fill="FFFFFF"/>
           </w:tcPr>
           <w:p>
             <w:r/>
@@ -6641,6 +6876,7 @@
               <w:bottom w:val="nil"/>
               <w:right w:val="nil"/>
             </w:tcBorders>
+            <w:shd w:val="clear" w:color="auto" w:fill="FFFFFF"/>
           </w:tcPr>
           <w:p>
             <w:r/>
@@ -6664,6 +6900,7 @@
               <w:bottom w:val="nil"/>
               <w:right w:val="nil"/>
             </w:tcBorders>
+            <w:shd w:val="clear" w:color="auto" w:fill="FFFFFF"/>
           </w:tcPr>
           <w:p>
             <w:r/>
@@ -6685,6 +6922,7 @@
               <w:bottom w:val="nil"/>
               <w:right w:val="nil"/>
             </w:tcBorders>
+            <w:shd w:val="clear" w:color="auto" w:fill="FFFFFF"/>
           </w:tcPr>
           <w:p>
             <w:r/>
@@ -6706,6 +6944,7 @@
               <w:bottom w:val="nil"/>
               <w:right w:val="nil"/>
             </w:tcBorders>
+            <w:shd w:val="clear" w:color="auto" w:fill="FFFFFF"/>
           </w:tcPr>
           <w:p>
             <w:r/>
@@ -6727,6 +6966,7 @@
               <w:bottom w:val="nil"/>
               <w:right w:val="nil"/>
             </w:tcBorders>
+            <w:shd w:val="clear" w:color="auto" w:fill="FFFFFF"/>
           </w:tcPr>
           <w:p>
             <w:r/>
@@ -6748,6 +6988,7 @@
               <w:bottom w:val="nil"/>
               <w:right w:val="nil"/>
             </w:tcBorders>
+            <w:shd w:val="clear" w:color="auto" w:fill="FFFFFF"/>
           </w:tcPr>
           <w:p>
             <w:r/>
@@ -6769,6 +7010,7 @@
               <w:bottom w:val="nil"/>
               <w:right w:val="nil"/>
             </w:tcBorders>
+            <w:shd w:val="clear" w:color="auto" w:fill="FFFFFF"/>
           </w:tcPr>
           <w:p>
             <w:r/>
@@ -6790,6 +7032,7 @@
               <w:bottom w:val="nil"/>
               <w:right w:val="nil"/>
             </w:tcBorders>
+            <w:shd w:val="clear" w:color="auto" w:fill="FFFFFF"/>
           </w:tcPr>
           <w:p>
             <w:r/>
@@ -6813,6 +7056,7 @@
               <w:bottom w:val="nil"/>
               <w:right w:val="nil"/>
             </w:tcBorders>
+            <w:shd w:val="clear" w:color="auto" w:fill="FFFFFF"/>
           </w:tcPr>
           <w:p>
             <w:r/>
@@ -6834,6 +7078,7 @@
               <w:bottom w:val="nil"/>
               <w:right w:val="nil"/>
             </w:tcBorders>
+            <w:shd w:val="clear" w:color="auto" w:fill="FFFFFF"/>
           </w:tcPr>
           <w:p>
             <w:r/>
@@ -6855,6 +7100,7 @@
               <w:bottom w:val="nil"/>
               <w:right w:val="nil"/>
             </w:tcBorders>
+            <w:shd w:val="clear" w:color="auto" w:fill="FFFFFF"/>
           </w:tcPr>
           <w:p>
             <w:r/>
@@ -6876,6 +7122,7 @@
               <w:bottom w:val="nil"/>
               <w:right w:val="nil"/>
             </w:tcBorders>
+            <w:shd w:val="clear" w:color="auto" w:fill="FFFFFF"/>
           </w:tcPr>
           <w:p>
             <w:r/>
@@ -6897,6 +7144,7 @@
               <w:bottom w:val="nil"/>
               <w:right w:val="nil"/>
             </w:tcBorders>
+            <w:shd w:val="clear" w:color="auto" w:fill="FFFFFF"/>
           </w:tcPr>
           <w:p>
             <w:r/>
@@ -6918,6 +7166,7 @@
               <w:bottom w:val="nil"/>
               <w:right w:val="nil"/>
             </w:tcBorders>
+            <w:shd w:val="clear" w:color="auto" w:fill="FFFFFF"/>
           </w:tcPr>
           <w:p>
             <w:r/>
@@ -6939,6 +7188,7 @@
               <w:bottom w:val="nil"/>
               <w:right w:val="nil"/>
             </w:tcBorders>
+            <w:shd w:val="clear" w:color="auto" w:fill="FFFFFF"/>
           </w:tcPr>
           <w:p>
             <w:r/>
@@ -6962,6 +7212,7 @@
               <w:bottom w:val="nil"/>
               <w:right w:val="nil"/>
             </w:tcBorders>
+            <w:shd w:val="clear" w:color="auto" w:fill="FFFFFF"/>
           </w:tcPr>
           <w:p>
             <w:r/>
@@ -6983,6 +7234,7 @@
               <w:bottom w:val="nil"/>
               <w:right w:val="nil"/>
             </w:tcBorders>
+            <w:shd w:val="clear" w:color="auto" w:fill="FFFFFF"/>
           </w:tcPr>
           <w:p>
             <w:r/>
@@ -7004,6 +7256,7 @@
               <w:bottom w:val="nil"/>
               <w:right w:val="nil"/>
             </w:tcBorders>
+            <w:shd w:val="clear" w:color="auto" w:fill="FFFFFF"/>
           </w:tcPr>
           <w:p>
             <w:r/>
@@ -7025,6 +7278,7 @@
               <w:bottom w:val="nil"/>
               <w:right w:val="nil"/>
             </w:tcBorders>
+            <w:shd w:val="clear" w:color="auto" w:fill="FFFFFF"/>
           </w:tcPr>
           <w:p>
             <w:r/>
@@ -7046,6 +7300,7 @@
               <w:bottom w:val="nil"/>
               <w:right w:val="nil"/>
             </w:tcBorders>
+            <w:shd w:val="clear" w:color="auto" w:fill="FFFFFF"/>
           </w:tcPr>
           <w:p>
             <w:r/>
@@ -7067,6 +7322,7 @@
               <w:bottom w:val="nil"/>
               <w:right w:val="nil"/>
             </w:tcBorders>
+            <w:shd w:val="clear" w:color="auto" w:fill="FFFFFF"/>
           </w:tcPr>
           <w:p>
             <w:r/>
@@ -7088,6 +7344,7 @@
               <w:bottom w:val="nil"/>
               <w:right w:val="nil"/>
             </w:tcBorders>
+            <w:shd w:val="clear" w:color="auto" w:fill="FFFFFF"/>
           </w:tcPr>
           <w:p>
             <w:r/>
@@ -7111,6 +7368,7 @@
               <w:bottom w:val="nil"/>
               <w:right w:val="nil"/>
             </w:tcBorders>
+            <w:shd w:val="clear" w:color="auto" w:fill="FFFFFF"/>
           </w:tcPr>
           <w:p>
             <w:r/>
@@ -7132,6 +7390,7 @@
               <w:bottom w:val="nil"/>
               <w:right w:val="nil"/>
             </w:tcBorders>
+            <w:shd w:val="clear" w:color="auto" w:fill="FFFFFF"/>
           </w:tcPr>
           <w:p>
             <w:r/>
@@ -7153,6 +7412,7 @@
               <w:bottom w:val="nil"/>
               <w:right w:val="nil"/>
             </w:tcBorders>
+            <w:shd w:val="clear" w:color="auto" w:fill="FFFFFF"/>
           </w:tcPr>
           <w:p>
             <w:r/>
@@ -7174,6 +7434,7 @@
               <w:bottom w:val="nil"/>
               <w:right w:val="nil"/>
             </w:tcBorders>
+            <w:shd w:val="clear" w:color="auto" w:fill="FFFFFF"/>
           </w:tcPr>
           <w:p>
             <w:r/>
@@ -7195,6 +7456,7 @@
               <w:bottom w:val="nil"/>
               <w:right w:val="nil"/>
             </w:tcBorders>
+            <w:shd w:val="clear" w:color="auto" w:fill="FFFFFF"/>
           </w:tcPr>
           <w:p>
             <w:r/>
@@ -7216,6 +7478,7 @@
               <w:bottom w:val="nil"/>
               <w:right w:val="nil"/>
             </w:tcBorders>
+            <w:shd w:val="clear" w:color="auto" w:fill="FFFFFF"/>
           </w:tcPr>
           <w:p>
             <w:r/>
@@ -7237,6 +7500,7 @@
               <w:bottom w:val="nil"/>
               <w:right w:val="nil"/>
             </w:tcBorders>
+            <w:shd w:val="clear" w:color="auto" w:fill="FFFFFF"/>
           </w:tcPr>
           <w:p>
             <w:r/>
@@ -7260,6 +7524,7 @@
               <w:bottom w:val="nil"/>
               <w:right w:val="nil"/>
             </w:tcBorders>
+            <w:shd w:val="clear" w:color="auto" w:fill="FFFFFF"/>
           </w:tcPr>
           <w:p>
             <w:r/>
@@ -7281,6 +7546,7 @@
               <w:bottom w:val="nil"/>
               <w:right w:val="nil"/>
             </w:tcBorders>
+            <w:shd w:val="clear" w:color="auto" w:fill="FFFFFF"/>
           </w:tcPr>
           <w:p>
             <w:r/>
@@ -7302,6 +7568,7 @@
               <w:bottom w:val="nil"/>
               <w:right w:val="nil"/>
             </w:tcBorders>
+            <w:shd w:val="clear" w:color="auto" w:fill="FFFFFF"/>
           </w:tcPr>
           <w:p>
             <w:r/>
@@ -7323,6 +7590,7 @@
               <w:bottom w:val="nil"/>
               <w:right w:val="nil"/>
             </w:tcBorders>
+            <w:shd w:val="clear" w:color="auto" w:fill="FFFFFF"/>
           </w:tcPr>
           <w:p>
             <w:r/>
@@ -7344,6 +7612,7 @@
               <w:bottom w:val="nil"/>
               <w:right w:val="nil"/>
             </w:tcBorders>
+            <w:shd w:val="clear" w:color="auto" w:fill="FFFFFF"/>
           </w:tcPr>
           <w:p>
             <w:r/>
@@ -7365,6 +7634,7 @@
               <w:bottom w:val="nil"/>
               <w:right w:val="nil"/>
             </w:tcBorders>
+            <w:shd w:val="clear" w:color="auto" w:fill="FFFFFF"/>
           </w:tcPr>
           <w:p>
             <w:r/>
@@ -7386,6 +7656,7 @@
               <w:bottom w:val="nil"/>
               <w:right w:val="nil"/>
             </w:tcBorders>
+            <w:shd w:val="clear" w:color="auto" w:fill="FFFFFF"/>
           </w:tcPr>
           <w:p>
             <w:r/>
@@ -7409,6 +7680,7 @@
               <w:bottom w:val="nil"/>
               <w:right w:val="nil"/>
             </w:tcBorders>
+            <w:shd w:val="clear" w:color="auto" w:fill="FFFFFF"/>
           </w:tcPr>
           <w:p>
             <w:r/>
@@ -7430,6 +7702,7 @@
               <w:bottom w:val="nil"/>
               <w:right w:val="nil"/>
             </w:tcBorders>
+            <w:shd w:val="clear" w:color="auto" w:fill="FFFFFF"/>
           </w:tcPr>
           <w:p>
             <w:r/>
@@ -7451,6 +7724,7 @@
               <w:bottom w:val="nil"/>
               <w:right w:val="nil"/>
             </w:tcBorders>
+            <w:shd w:val="clear" w:color="auto" w:fill="FFFFFF"/>
           </w:tcPr>
           <w:p>
             <w:r/>
@@ -7472,6 +7746,7 @@
               <w:bottom w:val="nil"/>
               <w:right w:val="nil"/>
             </w:tcBorders>
+            <w:shd w:val="clear" w:color="auto" w:fill="FFFFFF"/>
           </w:tcPr>
           <w:p>
             <w:r/>
@@ -7493,6 +7768,7 @@
               <w:bottom w:val="nil"/>
               <w:right w:val="nil"/>
             </w:tcBorders>
+            <w:shd w:val="clear" w:color="auto" w:fill="FFFFFF"/>
           </w:tcPr>
           <w:p>
             <w:r/>
@@ -7514,6 +7790,7 @@
               <w:bottom w:val="nil"/>
               <w:right w:val="nil"/>
             </w:tcBorders>
+            <w:shd w:val="clear" w:color="auto" w:fill="FFFFFF"/>
           </w:tcPr>
           <w:p>
             <w:r/>
@@ -7535,6 +7812,7 @@
               <w:bottom w:val="nil"/>
               <w:right w:val="nil"/>
             </w:tcBorders>
+            <w:shd w:val="clear" w:color="auto" w:fill="FFFFFF"/>
           </w:tcPr>
           <w:p>
             <w:r/>
@@ -7558,6 +7836,7 @@
               <w:bottom w:val="nil"/>
               <w:right w:val="nil"/>
             </w:tcBorders>
+            <w:shd w:val="clear" w:color="auto" w:fill="FFFFFF"/>
           </w:tcPr>
           <w:p>
             <w:r/>
@@ -7579,6 +7858,7 @@
               <w:bottom w:val="nil"/>
               <w:right w:val="nil"/>
             </w:tcBorders>
+            <w:shd w:val="clear" w:color="auto" w:fill="FFFFFF"/>
           </w:tcPr>
           <w:p>
             <w:r/>
@@ -7600,6 +7880,7 @@
               <w:bottom w:val="nil"/>
               <w:right w:val="nil"/>
             </w:tcBorders>
+            <w:shd w:val="clear" w:color="auto" w:fill="FFFFFF"/>
           </w:tcPr>
           <w:p>
             <w:r/>
@@ -7621,6 +7902,7 @@
               <w:bottom w:val="nil"/>
               <w:right w:val="nil"/>
             </w:tcBorders>
+            <w:shd w:val="clear" w:color="auto" w:fill="FFFFFF"/>
           </w:tcPr>
           <w:p>
             <w:r/>
@@ -7642,6 +7924,7 @@
               <w:bottom w:val="nil"/>
               <w:right w:val="nil"/>
             </w:tcBorders>
+            <w:shd w:val="clear" w:color="auto" w:fill="FFFFFF"/>
           </w:tcPr>
           <w:p>
             <w:r/>
@@ -7663,6 +7946,7 @@
               <w:bottom w:val="nil"/>
               <w:right w:val="nil"/>
             </w:tcBorders>
+            <w:shd w:val="clear" w:color="auto" w:fill="FFFFFF"/>
           </w:tcPr>
           <w:p>
             <w:r/>
@@ -7684,6 +7968,7 @@
               <w:bottom w:val="nil"/>
               <w:right w:val="nil"/>
             </w:tcBorders>
+            <w:shd w:val="clear" w:color="auto" w:fill="FFFFFF"/>
           </w:tcPr>
           <w:p>
             <w:r/>
@@ -7707,6 +7992,7 @@
               <w:bottom w:val="nil"/>
               <w:right w:val="nil"/>
             </w:tcBorders>
+            <w:shd w:val="clear" w:color="auto" w:fill="FFFFFF"/>
           </w:tcPr>
           <w:p>
             <w:r/>
@@ -7728,6 +8014,7 @@
               <w:bottom w:val="nil"/>
               <w:right w:val="nil"/>
             </w:tcBorders>
+            <w:shd w:val="clear" w:color="auto" w:fill="FFFFFF"/>
           </w:tcPr>
           <w:p>
             <w:r/>
@@ -7749,6 +8036,7 @@
               <w:bottom w:val="nil"/>
               <w:right w:val="nil"/>
             </w:tcBorders>
+            <w:shd w:val="clear" w:color="auto" w:fill="FFFFFF"/>
           </w:tcPr>
           <w:p>
             <w:r/>
@@ -7770,6 +8058,7 @@
               <w:bottom w:val="nil"/>
               <w:right w:val="nil"/>
             </w:tcBorders>
+            <w:shd w:val="clear" w:color="auto" w:fill="FFFFFF"/>
           </w:tcPr>
           <w:p>
             <w:r/>
@@ -7791,6 +8080,7 @@
               <w:bottom w:val="nil"/>
               <w:right w:val="nil"/>
             </w:tcBorders>
+            <w:shd w:val="clear" w:color="auto" w:fill="FFFFFF"/>
           </w:tcPr>
           <w:p>
             <w:r/>
@@ -7812,6 +8102,7 @@
               <w:bottom w:val="nil"/>
               <w:right w:val="nil"/>
             </w:tcBorders>
+            <w:shd w:val="clear" w:color="auto" w:fill="FFFFFF"/>
           </w:tcPr>
           <w:p>
             <w:r/>
@@ -7833,6 +8124,7 @@
               <w:bottom w:val="nil"/>
               <w:right w:val="nil"/>
             </w:tcBorders>
+            <w:shd w:val="clear" w:color="auto" w:fill="FFFFFF"/>
           </w:tcPr>
           <w:p>
             <w:r/>
@@ -7856,6 +8148,7 @@
               <w:bottom w:val="nil"/>
               <w:right w:val="nil"/>
             </w:tcBorders>
+            <w:shd w:val="clear" w:color="auto" w:fill="FFFFFF"/>
           </w:tcPr>
           <w:p>
             <w:r/>
@@ -7877,6 +8170,7 @@
               <w:bottom w:val="nil"/>
               <w:right w:val="nil"/>
             </w:tcBorders>
+            <w:shd w:val="clear" w:color="auto" w:fill="FFFFFF"/>
           </w:tcPr>
           <w:p>
             <w:r/>
@@ -7898,6 +8192,7 @@
               <w:bottom w:val="nil"/>
               <w:right w:val="nil"/>
             </w:tcBorders>
+            <w:shd w:val="clear" w:color="auto" w:fill="FFFFFF"/>
           </w:tcPr>
           <w:p>
             <w:r/>
@@ -7919,6 +8214,7 @@
               <w:bottom w:val="nil"/>
               <w:right w:val="nil"/>
             </w:tcBorders>
+            <w:shd w:val="clear" w:color="auto" w:fill="FFFFFF"/>
           </w:tcPr>
           <w:p>
             <w:r/>
@@ -7940,6 +8236,7 @@
               <w:bottom w:val="nil"/>
               <w:right w:val="nil"/>
             </w:tcBorders>
+            <w:shd w:val="clear" w:color="auto" w:fill="FFFFFF"/>
           </w:tcPr>
           <w:p>
             <w:r/>
@@ -7961,6 +8258,7 @@
               <w:bottom w:val="nil"/>
               <w:right w:val="nil"/>
             </w:tcBorders>
+            <w:shd w:val="clear" w:color="auto" w:fill="FFFFFF"/>
           </w:tcPr>
           <w:p>
             <w:r/>
@@ -7982,6 +8280,7 @@
               <w:bottom w:val="nil"/>
               <w:right w:val="nil"/>
             </w:tcBorders>
+            <w:shd w:val="clear" w:color="auto" w:fill="FFFFFF"/>
           </w:tcPr>
           <w:p>
             <w:r/>
@@ -8005,6 +8304,7 @@
               <w:bottom w:val="nil"/>
               <w:right w:val="nil"/>
             </w:tcBorders>
+            <w:shd w:val="clear" w:color="auto" w:fill="FFFFFF"/>
           </w:tcPr>
           <w:p>
             <w:r/>
@@ -8026,6 +8326,7 @@
               <w:bottom w:val="nil"/>
               <w:right w:val="nil"/>
             </w:tcBorders>
+            <w:shd w:val="clear" w:color="auto" w:fill="FFFFFF"/>
           </w:tcPr>
           <w:p>
             <w:r/>
@@ -8047,6 +8348,7 @@
               <w:bottom w:val="nil"/>
               <w:right w:val="nil"/>
             </w:tcBorders>
+            <w:shd w:val="clear" w:color="auto" w:fill="FFFFFF"/>
           </w:tcPr>
           <w:p>
             <w:r/>
@@ -8068,6 +8370,7 @@
               <w:bottom w:val="nil"/>
               <w:right w:val="nil"/>
             </w:tcBorders>
+            <w:shd w:val="clear" w:color="auto" w:fill="FFFFFF"/>
           </w:tcPr>
           <w:p>
             <w:r/>
@@ -8089,6 +8392,7 @@
               <w:bottom w:val="nil"/>
               <w:right w:val="nil"/>
             </w:tcBorders>
+            <w:shd w:val="clear" w:color="auto" w:fill="FFFFFF"/>
           </w:tcPr>
           <w:p>
             <w:r/>
@@ -8110,6 +8414,7 @@
               <w:bottom w:val="nil"/>
               <w:right w:val="nil"/>
             </w:tcBorders>
+            <w:shd w:val="clear" w:color="auto" w:fill="FFFFFF"/>
           </w:tcPr>
           <w:p>
             <w:r/>
@@ -8131,6 +8436,7 @@
               <w:bottom w:val="nil"/>
               <w:right w:val="nil"/>
             </w:tcBorders>
+            <w:shd w:val="clear" w:color="auto" w:fill="FFFFFF"/>
           </w:tcPr>
           <w:p>
             <w:r/>
@@ -8154,6 +8460,7 @@
               <w:bottom w:val="nil"/>
               <w:right w:val="nil"/>
             </w:tcBorders>
+            <w:shd w:val="clear" w:color="auto" w:fill="FFFFFF"/>
           </w:tcPr>
           <w:p>
             <w:r/>
@@ -8175,6 +8482,7 @@
               <w:bottom w:val="nil"/>
               <w:right w:val="nil"/>
             </w:tcBorders>
+            <w:shd w:val="clear" w:color="auto" w:fill="FFFFFF"/>
           </w:tcPr>
           <w:p>
             <w:r/>
@@ -8196,6 +8504,7 @@
               <w:bottom w:val="nil"/>
               <w:right w:val="nil"/>
             </w:tcBorders>
+            <w:shd w:val="clear" w:color="auto" w:fill="FFFFFF"/>
           </w:tcPr>
           <w:p>
             <w:r/>
@@ -8217,6 +8526,7 @@
               <w:bottom w:val="nil"/>
               <w:right w:val="nil"/>
             </w:tcBorders>
+            <w:shd w:val="clear" w:color="auto" w:fill="FFFFFF"/>
           </w:tcPr>
           <w:p>
             <w:r/>
@@ -8238,6 +8548,7 @@
               <w:bottom w:val="nil"/>
               <w:right w:val="nil"/>
             </w:tcBorders>
+            <w:shd w:val="clear" w:color="auto" w:fill="FFFFFF"/>
           </w:tcPr>
           <w:p>
             <w:r/>
@@ -8259,6 +8570,7 @@
               <w:bottom w:val="nil"/>
               <w:right w:val="nil"/>
             </w:tcBorders>
+            <w:shd w:val="clear" w:color="auto" w:fill="FFFFFF"/>
           </w:tcPr>
           <w:p>
             <w:r/>
@@ -8280,6 +8592,7 @@
               <w:bottom w:val="nil"/>
               <w:right w:val="nil"/>
             </w:tcBorders>
+            <w:shd w:val="clear" w:color="auto" w:fill="FFFFFF"/>
           </w:tcPr>
           <w:p>
             <w:r/>
@@ -8303,6 +8616,7 @@
               <w:bottom w:val="nil"/>
               <w:right w:val="nil"/>
             </w:tcBorders>
+            <w:shd w:val="clear" w:color="auto" w:fill="FFFFFF"/>
           </w:tcPr>
           <w:p>
             <w:r/>
@@ -8324,6 +8638,7 @@
               <w:bottom w:val="nil"/>
               <w:right w:val="nil"/>
             </w:tcBorders>
+            <w:shd w:val="clear" w:color="auto" w:fill="FFFFFF"/>
           </w:tcPr>
           <w:p>
             <w:r/>
@@ -8345,6 +8660,7 @@
               <w:bottom w:val="nil"/>
               <w:right w:val="nil"/>
             </w:tcBorders>
+            <w:shd w:val="clear" w:color="auto" w:fill="FFFFFF"/>
           </w:tcPr>
           <w:p>
             <w:r/>
@@ -8366,6 +8682,7 @@
               <w:bottom w:val="nil"/>
               <w:right w:val="nil"/>
             </w:tcBorders>
+            <w:shd w:val="clear" w:color="auto" w:fill="FFFFFF"/>
           </w:tcPr>
           <w:p>
             <w:r/>
@@ -8387,6 +8704,7 @@
               <w:bottom w:val="nil"/>
               <w:right w:val="nil"/>
             </w:tcBorders>
+            <w:shd w:val="clear" w:color="auto" w:fill="FFFFFF"/>
           </w:tcPr>
           <w:p>
             <w:r/>
@@ -8408,6 +8726,7 @@
               <w:bottom w:val="nil"/>
               <w:right w:val="nil"/>
             </w:tcBorders>
+            <w:shd w:val="clear" w:color="auto" w:fill="FFFFFF"/>
           </w:tcPr>
           <w:p>
             <w:r/>
@@ -8429,6 +8748,7 @@
               <w:bottom w:val="nil"/>
               <w:right w:val="nil"/>
             </w:tcBorders>
+            <w:shd w:val="clear" w:color="auto" w:fill="FFFFFF"/>
           </w:tcPr>
           <w:p>
             <w:r/>
@@ -8452,6 +8772,7 @@
               <w:bottom w:val="nil"/>
               <w:right w:val="nil"/>
             </w:tcBorders>
+            <w:shd w:val="clear" w:color="auto" w:fill="FFFFFF"/>
           </w:tcPr>
           <w:p>
             <w:r/>
@@ -8473,6 +8794,7 @@
               <w:bottom w:val="nil"/>
               <w:right w:val="nil"/>
             </w:tcBorders>
+            <w:shd w:val="clear" w:color="auto" w:fill="FFFFFF"/>
           </w:tcPr>
           <w:p>
             <w:r/>
@@ -8494,6 +8816,7 @@
               <w:bottom w:val="nil"/>
               <w:right w:val="nil"/>
             </w:tcBorders>
+            <w:shd w:val="clear" w:color="auto" w:fill="FFFFFF"/>
           </w:tcPr>
           <w:p>
             <w:r/>
@@ -8515,6 +8838,7 @@
               <w:bottom w:val="nil"/>
               <w:right w:val="nil"/>
             </w:tcBorders>
+            <w:shd w:val="clear" w:color="auto" w:fill="FFFFFF"/>
           </w:tcPr>
           <w:p>
             <w:r/>
@@ -8536,6 +8860,7 @@
               <w:bottom w:val="nil"/>
               <w:right w:val="nil"/>
             </w:tcBorders>
+            <w:shd w:val="clear" w:color="auto" w:fill="FFFFFF"/>
           </w:tcPr>
           <w:p>
             <w:r/>
@@ -8557,6 +8882,7 @@
               <w:bottom w:val="nil"/>
               <w:right w:val="nil"/>
             </w:tcBorders>
+            <w:shd w:val="clear" w:color="auto" w:fill="FFFFFF"/>
           </w:tcPr>
           <w:p>
             <w:r/>
@@ -8578,6 +8904,7 @@
               <w:bottom w:val="nil"/>
               <w:right w:val="nil"/>
             </w:tcBorders>
+            <w:shd w:val="clear" w:color="auto" w:fill="FFFFFF"/>
           </w:tcPr>
           <w:p>
             <w:r/>
@@ -8601,6 +8928,7 @@
               <w:bottom w:val="nil"/>
               <w:right w:val="nil"/>
             </w:tcBorders>
+            <w:shd w:val="clear" w:color="auto" w:fill="FFFFFF"/>
           </w:tcPr>
           <w:p>
             <w:r/>
@@ -8622,6 +8950,7 @@
               <w:bottom w:val="nil"/>
               <w:right w:val="nil"/>
             </w:tcBorders>
+            <w:shd w:val="clear" w:color="auto" w:fill="FFFFFF"/>
           </w:tcPr>
           <w:p>
             <w:r/>
@@ -8643,6 +8972,7 @@
               <w:bottom w:val="nil"/>
               <w:right w:val="nil"/>
             </w:tcBorders>
+            <w:shd w:val="clear" w:color="auto" w:fill="FFFFFF"/>
           </w:tcPr>
           <w:p>
             <w:r/>
@@ -8664,6 +8994,7 @@
               <w:bottom w:val="nil"/>
               <w:right w:val="nil"/>
             </w:tcBorders>
+            <w:shd w:val="clear" w:color="auto" w:fill="FFFFFF"/>
           </w:tcPr>
           <w:p>
             <w:r/>
@@ -8685,6 +9016,7 @@
               <w:bottom w:val="nil"/>
               <w:right w:val="nil"/>
             </w:tcBorders>
+            <w:shd w:val="clear" w:color="auto" w:fill="FFFFFF"/>
           </w:tcPr>
           <w:p>
             <w:r/>
@@ -8706,6 +9038,7 @@
               <w:bottom w:val="nil"/>
               <w:right w:val="nil"/>
             </w:tcBorders>
+            <w:shd w:val="clear" w:color="auto" w:fill="FFFFFF"/>
           </w:tcPr>
           <w:p>
             <w:r/>
@@ -8727,6 +9060,7 @@
               <w:bottom w:val="nil"/>
               <w:right w:val="nil"/>
             </w:tcBorders>
+            <w:shd w:val="clear" w:color="auto" w:fill="FFFFFF"/>
           </w:tcPr>
           <w:p>
             <w:r/>
@@ -8750,6 +9084,7 @@
               <w:bottom w:val="nil"/>
               <w:right w:val="nil"/>
             </w:tcBorders>
+            <w:shd w:val="clear" w:color="auto" w:fill="FFFFFF"/>
           </w:tcPr>
           <w:p>
             <w:r/>
@@ -8767,6 +9102,7 @@
               <w:bottom w:val="nil"/>
               <w:right w:val="nil"/>
             </w:tcBorders>
+            <w:shd w:val="clear" w:color="auto" w:fill="FFFFFF"/>
           </w:tcPr>
           <w:p>
             <w:r/>
@@ -8784,6 +9120,7 @@
               <w:bottom w:val="nil"/>
               <w:right w:val="nil"/>
             </w:tcBorders>
+            <w:shd w:val="clear" w:color="auto" w:fill="FFFFFF"/>
           </w:tcPr>
           <w:p>
             <w:r/>
@@ -8801,6 +9138,7 @@
               <w:bottom w:val="nil"/>
               <w:right w:val="nil"/>
             </w:tcBorders>
+            <w:shd w:val="clear" w:color="auto" w:fill="FFFFFF"/>
           </w:tcPr>
           <w:p>
             <w:r/>
@@ -8818,6 +9156,7 @@
               <w:bottom w:val="nil"/>
               <w:right w:val="nil"/>
             </w:tcBorders>
+            <w:shd w:val="clear" w:color="auto" w:fill="FFFFFF"/>
           </w:tcPr>
           <w:p>
             <w:r/>
@@ -8835,6 +9174,7 @@
               <w:bottom w:val="nil"/>
               <w:right w:val="nil"/>
             </w:tcBorders>
+            <w:shd w:val="clear" w:color="auto" w:fill="FFFFFF"/>
           </w:tcPr>
           <w:p>
             <w:r/>
@@ -8852,6 +9192,7 @@
               <w:bottom w:val="nil"/>
               <w:right w:val="nil"/>
             </w:tcBorders>
+            <w:shd w:val="clear" w:color="auto" w:fill="FFFFFF"/>
           </w:tcPr>
           <w:p>
             <w:r/>
@@ -8871,6 +9212,7 @@
               <w:bottom w:val="nil"/>
               <w:right w:val="nil"/>
             </w:tcBorders>
+            <w:shd w:val="clear" w:color="auto" w:fill="FFFFFF"/>
           </w:tcPr>
           <w:p>
             <w:r/>
@@ -8888,6 +9230,7 @@
               <w:bottom w:val="nil"/>
               <w:right w:val="nil"/>
             </w:tcBorders>
+            <w:shd w:val="clear" w:color="auto" w:fill="FFFFFF"/>
           </w:tcPr>
           <w:p>
             <w:r/>
@@ -8905,6 +9248,7 @@
               <w:bottom w:val="nil"/>
               <w:right w:val="nil"/>
             </w:tcBorders>
+            <w:shd w:val="clear" w:color="auto" w:fill="FFFFFF"/>
           </w:tcPr>
           <w:p>
             <w:r/>
@@ -8922,6 +9266,7 @@
               <w:bottom w:val="nil"/>
               <w:right w:val="nil"/>
             </w:tcBorders>
+            <w:shd w:val="clear" w:color="auto" w:fill="FFFFFF"/>
           </w:tcPr>
           <w:p>
             <w:r/>
@@ -8939,6 +9284,7 @@
               <w:bottom w:val="nil"/>
               <w:right w:val="nil"/>
             </w:tcBorders>
+            <w:shd w:val="clear" w:color="auto" w:fill="FFFFFF"/>
           </w:tcPr>
           <w:p>
             <w:r/>
@@ -8956,6 +9302,7 @@
               <w:bottom w:val="nil"/>
               <w:right w:val="nil"/>
             </w:tcBorders>
+            <w:shd w:val="clear" w:color="auto" w:fill="FFFFFF"/>
           </w:tcPr>
           <w:p>
             <w:r/>
@@ -8973,6 +9320,7 @@
               <w:bottom w:val="nil"/>
               <w:right w:val="nil"/>
             </w:tcBorders>
+            <w:shd w:val="clear" w:color="auto" w:fill="FFFFFF"/>
           </w:tcPr>
           <w:p>
             <w:r/>
@@ -8992,6 +9340,7 @@
               <w:bottom w:val="single" w:sz="12" w:space="0" w:color="000000"/>
               <w:right w:val="nil"/>
             </w:tcBorders>
+            <w:shd w:val="clear" w:color="auto" w:fill="FFFFFF"/>
           </w:tcPr>
           <w:p>
             <w:r/>
@@ -9009,6 +9358,7 @@
               <w:bottom w:val="single" w:sz="12" w:space="0" w:color="000000"/>
               <w:right w:val="nil"/>
             </w:tcBorders>
+            <w:shd w:val="clear" w:color="auto" w:fill="FFFFFF"/>
           </w:tcPr>
           <w:p>
             <w:r/>
@@ -9026,6 +9376,7 @@
               <w:bottom w:val="single" w:sz="12" w:space="0" w:color="000000"/>
               <w:right w:val="nil"/>
             </w:tcBorders>
+            <w:shd w:val="clear" w:color="auto" w:fill="FFFFFF"/>
           </w:tcPr>
           <w:p>
             <w:r/>
@@ -9043,6 +9394,7 @@
               <w:bottom w:val="single" w:sz="12" w:space="0" w:color="000000"/>
               <w:right w:val="nil"/>
             </w:tcBorders>
+            <w:shd w:val="clear" w:color="auto" w:fill="FFFFFF"/>
           </w:tcPr>
           <w:p>
             <w:r/>
@@ -9060,6 +9412,7 @@
               <w:bottom w:val="single" w:sz="12" w:space="0" w:color="000000"/>
               <w:right w:val="nil"/>
             </w:tcBorders>
+            <w:shd w:val="clear" w:color="auto" w:fill="FFFFFF"/>
           </w:tcPr>
           <w:p>
             <w:r/>
@@ -9077,6 +9430,7 @@
               <w:bottom w:val="single" w:sz="12" w:space="0" w:color="000000"/>
               <w:right w:val="nil"/>
             </w:tcBorders>
+            <w:shd w:val="clear" w:color="auto" w:fill="FFFFFF"/>
           </w:tcPr>
           <w:p>
             <w:r/>
@@ -9094,6 +9448,7 @@
               <w:bottom w:val="single" w:sz="12" w:space="0" w:color="000000"/>
               <w:right w:val="nil"/>
             </w:tcBorders>
+            <w:shd w:val="clear" w:color="auto" w:fill="FFFFFF"/>
           </w:tcPr>
           <w:p>
             <w:r/>
@@ -9121,9 +9476,8 @@
     </w:p>
     <w:tbl>
       <w:tblPr>
-        <w:tblStyle w:val="LightGrid-Accent1"/>
         <w:tblW w:type="auto" w:w="0"/>
-        <w:tblLook w:firstColumn="1" w:firstRow="1" w:lastColumn="0" w:lastRow="0" w:noHBand="0" w:noVBand="1" w:val="04A0"/>
+        <w:tblLook w:firstColumn="0" w:firstRow="0" w:lastColumn="0" w:lastRow="0" w:noHBand="1" w:noVBand="1" w:val="04A0"/>
         <w:tblBorders>
           <w:top w:val="nil"/>
           <w:left w:val="nil"/>
@@ -9150,6 +9504,7 @@
               <w:bottom w:val="single" w:sz="6" w:space="0" w:color="000000"/>
               <w:right w:val="nil"/>
             </w:tcBorders>
+            <w:shd w:val="clear" w:color="auto" w:fill="FFFFFF"/>
           </w:tcPr>
           <w:p>
             <w:r/>
@@ -9172,6 +9527,7 @@
               <w:bottom w:val="single" w:sz="6" w:space="0" w:color="000000"/>
               <w:right w:val="nil"/>
             </w:tcBorders>
+            <w:shd w:val="clear" w:color="auto" w:fill="FFFFFF"/>
           </w:tcPr>
           <w:p>
             <w:r/>
@@ -9194,6 +9550,7 @@
               <w:bottom w:val="single" w:sz="6" w:space="0" w:color="000000"/>
               <w:right w:val="nil"/>
             </w:tcBorders>
+            <w:shd w:val="clear" w:color="auto" w:fill="FFFFFF"/>
           </w:tcPr>
           <w:p>
             <w:r/>
@@ -9216,6 +9573,7 @@
               <w:bottom w:val="single" w:sz="6" w:space="0" w:color="000000"/>
               <w:right w:val="nil"/>
             </w:tcBorders>
+            <w:shd w:val="clear" w:color="auto" w:fill="FFFFFF"/>
           </w:tcPr>
           <w:p>
             <w:r/>
@@ -9238,6 +9596,7 @@
               <w:bottom w:val="single" w:sz="6" w:space="0" w:color="000000"/>
               <w:right w:val="nil"/>
             </w:tcBorders>
+            <w:shd w:val="clear" w:color="auto" w:fill="FFFFFF"/>
           </w:tcPr>
           <w:p>
             <w:r/>
@@ -9262,6 +9621,7 @@
               <w:bottom w:val="nil"/>
               <w:right w:val="nil"/>
             </w:tcBorders>
+            <w:shd w:val="clear" w:color="auto" w:fill="FFFFFF"/>
           </w:tcPr>
           <w:p>
             <w:r/>
@@ -9283,6 +9643,7 @@
               <w:bottom w:val="nil"/>
               <w:right w:val="nil"/>
             </w:tcBorders>
+            <w:shd w:val="clear" w:color="auto" w:fill="FFFFFF"/>
           </w:tcPr>
           <w:p>
             <w:r/>
@@ -9304,6 +9665,7 @@
               <w:bottom w:val="nil"/>
               <w:right w:val="nil"/>
             </w:tcBorders>
+            <w:shd w:val="clear" w:color="auto" w:fill="FFFFFF"/>
           </w:tcPr>
           <w:p>
             <w:r/>
@@ -9325,6 +9687,7 @@
               <w:bottom w:val="nil"/>
               <w:right w:val="nil"/>
             </w:tcBorders>
+            <w:shd w:val="clear" w:color="auto" w:fill="FFFFFF"/>
           </w:tcPr>
           <w:p>
             <w:r/>
@@ -9346,6 +9709,7 @@
               <w:bottom w:val="nil"/>
               <w:right w:val="nil"/>
             </w:tcBorders>
+            <w:shd w:val="clear" w:color="auto" w:fill="FFFFFF"/>
           </w:tcPr>
           <w:p>
             <w:r/>
@@ -9369,6 +9733,7 @@
               <w:bottom w:val="nil"/>
               <w:right w:val="nil"/>
             </w:tcBorders>
+            <w:shd w:val="clear" w:color="auto" w:fill="FFFFFF"/>
           </w:tcPr>
           <w:p>
             <w:r/>
@@ -9390,6 +9755,7 @@
               <w:bottom w:val="nil"/>
               <w:right w:val="nil"/>
             </w:tcBorders>
+            <w:shd w:val="clear" w:color="auto" w:fill="FFFFFF"/>
           </w:tcPr>
           <w:p>
             <w:r/>
@@ -9411,6 +9777,7 @@
               <w:bottom w:val="nil"/>
               <w:right w:val="nil"/>
             </w:tcBorders>
+            <w:shd w:val="clear" w:color="auto" w:fill="FFFFFF"/>
           </w:tcPr>
           <w:p>
             <w:r/>
@@ -9432,6 +9799,7 @@
               <w:bottom w:val="nil"/>
               <w:right w:val="nil"/>
             </w:tcBorders>
+            <w:shd w:val="clear" w:color="auto" w:fill="FFFFFF"/>
           </w:tcPr>
           <w:p>
             <w:r/>
@@ -9453,6 +9821,7 @@
               <w:bottom w:val="nil"/>
               <w:right w:val="nil"/>
             </w:tcBorders>
+            <w:shd w:val="clear" w:color="auto" w:fill="FFFFFF"/>
           </w:tcPr>
           <w:p>
             <w:r/>
@@ -9476,6 +9845,7 @@
               <w:bottom w:val="nil"/>
               <w:right w:val="nil"/>
             </w:tcBorders>
+            <w:shd w:val="clear" w:color="auto" w:fill="FFFFFF"/>
           </w:tcPr>
           <w:p>
             <w:r/>
@@ -9497,6 +9867,7 @@
               <w:bottom w:val="nil"/>
               <w:right w:val="nil"/>
             </w:tcBorders>
+            <w:shd w:val="clear" w:color="auto" w:fill="FFFFFF"/>
           </w:tcPr>
           <w:p>
             <w:r/>
@@ -9518,6 +9889,7 @@
               <w:bottom w:val="nil"/>
               <w:right w:val="nil"/>
             </w:tcBorders>
+            <w:shd w:val="clear" w:color="auto" w:fill="FFFFFF"/>
           </w:tcPr>
           <w:p>
             <w:r/>
@@ -9539,6 +9911,7 @@
               <w:bottom w:val="nil"/>
               <w:right w:val="nil"/>
             </w:tcBorders>
+            <w:shd w:val="clear" w:color="auto" w:fill="FFFFFF"/>
           </w:tcPr>
           <w:p>
             <w:r/>
@@ -9560,6 +9933,7 @@
               <w:bottom w:val="nil"/>
               <w:right w:val="nil"/>
             </w:tcBorders>
+            <w:shd w:val="clear" w:color="auto" w:fill="FFFFFF"/>
           </w:tcPr>
           <w:p>
             <w:r/>
@@ -9583,6 +9957,7 @@
               <w:bottom w:val="nil"/>
               <w:right w:val="nil"/>
             </w:tcBorders>
+            <w:shd w:val="clear" w:color="auto" w:fill="FFFFFF"/>
           </w:tcPr>
           <w:p>
             <w:r/>
@@ -9604,6 +9979,7 @@
               <w:bottom w:val="nil"/>
               <w:right w:val="nil"/>
             </w:tcBorders>
+            <w:shd w:val="clear" w:color="auto" w:fill="FFFFFF"/>
           </w:tcPr>
           <w:p>
             <w:r/>
@@ -9625,6 +10001,7 @@
               <w:bottom w:val="nil"/>
               <w:right w:val="nil"/>
             </w:tcBorders>
+            <w:shd w:val="clear" w:color="auto" w:fill="FFFFFF"/>
           </w:tcPr>
           <w:p>
             <w:r/>
@@ -9646,6 +10023,7 @@
               <w:bottom w:val="nil"/>
               <w:right w:val="nil"/>
             </w:tcBorders>
+            <w:shd w:val="clear" w:color="auto" w:fill="FFFFFF"/>
           </w:tcPr>
           <w:p>
             <w:r/>
@@ -9667,6 +10045,7 @@
               <w:bottom w:val="nil"/>
               <w:right w:val="nil"/>
             </w:tcBorders>
+            <w:shd w:val="clear" w:color="auto" w:fill="FFFFFF"/>
           </w:tcPr>
           <w:p>
             <w:r/>
@@ -9690,6 +10069,7 @@
               <w:bottom w:val="nil"/>
               <w:right w:val="nil"/>
             </w:tcBorders>
+            <w:shd w:val="clear" w:color="auto" w:fill="FFFFFF"/>
           </w:tcPr>
           <w:p>
             <w:r/>
@@ -9711,6 +10091,7 @@
               <w:bottom w:val="nil"/>
               <w:right w:val="nil"/>
             </w:tcBorders>
+            <w:shd w:val="clear" w:color="auto" w:fill="FFFFFF"/>
           </w:tcPr>
           <w:p>
             <w:r/>
@@ -9732,6 +10113,7 @@
               <w:bottom w:val="nil"/>
               <w:right w:val="nil"/>
             </w:tcBorders>
+            <w:shd w:val="clear" w:color="auto" w:fill="FFFFFF"/>
           </w:tcPr>
           <w:p>
             <w:r/>
@@ -9753,6 +10135,7 @@
               <w:bottom w:val="nil"/>
               <w:right w:val="nil"/>
             </w:tcBorders>
+            <w:shd w:val="clear" w:color="auto" w:fill="FFFFFF"/>
           </w:tcPr>
           <w:p>
             <w:r/>
@@ -9774,6 +10157,7 @@
               <w:bottom w:val="nil"/>
               <w:right w:val="nil"/>
             </w:tcBorders>
+            <w:shd w:val="clear" w:color="auto" w:fill="FFFFFF"/>
           </w:tcPr>
           <w:p>
             <w:r/>
@@ -9797,6 +10181,7 @@
               <w:bottom w:val="nil"/>
               <w:right w:val="nil"/>
             </w:tcBorders>
+            <w:shd w:val="clear" w:color="auto" w:fill="FFFFFF"/>
           </w:tcPr>
           <w:p>
             <w:r/>
@@ -9818,6 +10203,7 @@
               <w:bottom w:val="nil"/>
               <w:right w:val="nil"/>
             </w:tcBorders>
+            <w:shd w:val="clear" w:color="auto" w:fill="FFFFFF"/>
           </w:tcPr>
           <w:p>
             <w:r/>
@@ -9839,6 +10225,7 @@
               <w:bottom w:val="nil"/>
               <w:right w:val="nil"/>
             </w:tcBorders>
+            <w:shd w:val="clear" w:color="auto" w:fill="FFFFFF"/>
           </w:tcPr>
           <w:p>
             <w:r/>
@@ -9860,6 +10247,7 @@
               <w:bottom w:val="nil"/>
               <w:right w:val="nil"/>
             </w:tcBorders>
+            <w:shd w:val="clear" w:color="auto" w:fill="FFFFFF"/>
           </w:tcPr>
           <w:p>
             <w:r/>
@@ -9881,6 +10269,7 @@
               <w:bottom w:val="nil"/>
               <w:right w:val="nil"/>
             </w:tcBorders>
+            <w:shd w:val="clear" w:color="auto" w:fill="FFFFFF"/>
           </w:tcPr>
           <w:p>
             <w:r/>
@@ -9904,6 +10293,7 @@
               <w:bottom w:val="nil"/>
               <w:right w:val="nil"/>
             </w:tcBorders>
+            <w:shd w:val="clear" w:color="auto" w:fill="FFFFFF"/>
           </w:tcPr>
           <w:p>
             <w:r/>
@@ -9925,6 +10315,7 @@
               <w:bottom w:val="nil"/>
               <w:right w:val="nil"/>
             </w:tcBorders>
+            <w:shd w:val="clear" w:color="auto" w:fill="FFFFFF"/>
           </w:tcPr>
           <w:p>
             <w:r/>
@@ -9946,6 +10337,7 @@
               <w:bottom w:val="nil"/>
               <w:right w:val="nil"/>
             </w:tcBorders>
+            <w:shd w:val="clear" w:color="auto" w:fill="FFFFFF"/>
           </w:tcPr>
           <w:p>
             <w:r/>
@@ -9967,6 +10359,7 @@
               <w:bottom w:val="nil"/>
               <w:right w:val="nil"/>
             </w:tcBorders>
+            <w:shd w:val="clear" w:color="auto" w:fill="FFFFFF"/>
           </w:tcPr>
           <w:p>
             <w:r/>
@@ -9988,6 +10381,7 @@
               <w:bottom w:val="nil"/>
               <w:right w:val="nil"/>
             </w:tcBorders>
+            <w:shd w:val="clear" w:color="auto" w:fill="FFFFFF"/>
           </w:tcPr>
           <w:p>
             <w:r/>
@@ -10011,6 +10405,7 @@
               <w:bottom w:val="nil"/>
               <w:right w:val="nil"/>
             </w:tcBorders>
+            <w:shd w:val="clear" w:color="auto" w:fill="FFFFFF"/>
           </w:tcPr>
           <w:p>
             <w:r/>
@@ -10032,6 +10427,7 @@
               <w:bottom w:val="nil"/>
               <w:right w:val="nil"/>
             </w:tcBorders>
+            <w:shd w:val="clear" w:color="auto" w:fill="FFFFFF"/>
           </w:tcPr>
           <w:p>
             <w:r/>
@@ -10053,6 +10449,7 @@
               <w:bottom w:val="nil"/>
               <w:right w:val="nil"/>
             </w:tcBorders>
+            <w:shd w:val="clear" w:color="auto" w:fill="FFFFFF"/>
           </w:tcPr>
           <w:p>
             <w:r/>
@@ -10074,6 +10471,7 @@
               <w:bottom w:val="nil"/>
               <w:right w:val="nil"/>
             </w:tcBorders>
+            <w:shd w:val="clear" w:color="auto" w:fill="FFFFFF"/>
           </w:tcPr>
           <w:p>
             <w:r/>
@@ -10095,6 +10493,7 @@
               <w:bottom w:val="nil"/>
               <w:right w:val="nil"/>
             </w:tcBorders>
+            <w:shd w:val="clear" w:color="auto" w:fill="FFFFFF"/>
           </w:tcPr>
           <w:p>
             <w:r/>
@@ -10118,6 +10517,7 @@
               <w:bottom w:val="nil"/>
               <w:right w:val="nil"/>
             </w:tcBorders>
+            <w:shd w:val="clear" w:color="auto" w:fill="FFFFFF"/>
           </w:tcPr>
           <w:p>
             <w:r/>
@@ -10139,6 +10539,7 @@
               <w:bottom w:val="nil"/>
               <w:right w:val="nil"/>
             </w:tcBorders>
+            <w:shd w:val="clear" w:color="auto" w:fill="FFFFFF"/>
           </w:tcPr>
           <w:p>
             <w:r/>
@@ -10160,6 +10561,7 @@
               <w:bottom w:val="nil"/>
               <w:right w:val="nil"/>
             </w:tcBorders>
+            <w:shd w:val="clear" w:color="auto" w:fill="FFFFFF"/>
           </w:tcPr>
           <w:p>
             <w:r/>
@@ -10181,6 +10583,7 @@
               <w:bottom w:val="nil"/>
               <w:right w:val="nil"/>
             </w:tcBorders>
+            <w:shd w:val="clear" w:color="auto" w:fill="FFFFFF"/>
           </w:tcPr>
           <w:p>
             <w:r/>
@@ -10202,6 +10605,7 @@
               <w:bottom w:val="nil"/>
               <w:right w:val="nil"/>
             </w:tcBorders>
+            <w:shd w:val="clear" w:color="auto" w:fill="FFFFFF"/>
           </w:tcPr>
           <w:p>
             <w:r/>
@@ -10225,6 +10629,7 @@
               <w:bottom w:val="nil"/>
               <w:right w:val="nil"/>
             </w:tcBorders>
+            <w:shd w:val="clear" w:color="auto" w:fill="FFFFFF"/>
           </w:tcPr>
           <w:p>
             <w:r/>
@@ -10246,6 +10651,7 @@
               <w:bottom w:val="nil"/>
               <w:right w:val="nil"/>
             </w:tcBorders>
+            <w:shd w:val="clear" w:color="auto" w:fill="FFFFFF"/>
           </w:tcPr>
           <w:p>
             <w:r/>
@@ -10267,6 +10673,7 @@
               <w:bottom w:val="nil"/>
               <w:right w:val="nil"/>
             </w:tcBorders>
+            <w:shd w:val="clear" w:color="auto" w:fill="FFFFFF"/>
           </w:tcPr>
           <w:p>
             <w:r/>
@@ -10288,6 +10695,7 @@
               <w:bottom w:val="nil"/>
               <w:right w:val="nil"/>
             </w:tcBorders>
+            <w:shd w:val="clear" w:color="auto" w:fill="FFFFFF"/>
           </w:tcPr>
           <w:p>
             <w:r/>
@@ -10309,6 +10717,7 @@
               <w:bottom w:val="nil"/>
               <w:right w:val="nil"/>
             </w:tcBorders>
+            <w:shd w:val="clear" w:color="auto" w:fill="FFFFFF"/>
           </w:tcPr>
           <w:p>
             <w:r/>
@@ -10332,6 +10741,7 @@
               <w:bottom w:val="nil"/>
               <w:right w:val="nil"/>
             </w:tcBorders>
+            <w:shd w:val="clear" w:color="auto" w:fill="FFFFFF"/>
           </w:tcPr>
           <w:p>
             <w:r/>
@@ -10353,6 +10763,7 @@
               <w:bottom w:val="nil"/>
               <w:right w:val="nil"/>
             </w:tcBorders>
+            <w:shd w:val="clear" w:color="auto" w:fill="FFFFFF"/>
           </w:tcPr>
           <w:p>
             <w:r/>
@@ -10374,6 +10785,7 @@
               <w:bottom w:val="nil"/>
               <w:right w:val="nil"/>
             </w:tcBorders>
+            <w:shd w:val="clear" w:color="auto" w:fill="FFFFFF"/>
           </w:tcPr>
           <w:p>
             <w:r/>
@@ -10395,6 +10807,7 @@
               <w:bottom w:val="nil"/>
               <w:right w:val="nil"/>
             </w:tcBorders>
+            <w:shd w:val="clear" w:color="auto" w:fill="FFFFFF"/>
           </w:tcPr>
           <w:p>
             <w:r/>
@@ -10416,6 +10829,7 @@
               <w:bottom w:val="nil"/>
               <w:right w:val="nil"/>
             </w:tcBorders>
+            <w:shd w:val="clear" w:color="auto" w:fill="FFFFFF"/>
           </w:tcPr>
           <w:p>
             <w:r/>
@@ -10439,6 +10853,7 @@
               <w:bottom w:val="nil"/>
               <w:right w:val="nil"/>
             </w:tcBorders>
+            <w:shd w:val="clear" w:color="auto" w:fill="FFFFFF"/>
           </w:tcPr>
           <w:p>
             <w:r/>
@@ -10460,6 +10875,7 @@
               <w:bottom w:val="nil"/>
               <w:right w:val="nil"/>
             </w:tcBorders>
+            <w:shd w:val="clear" w:color="auto" w:fill="FFFFFF"/>
           </w:tcPr>
           <w:p>
             <w:r/>
@@ -10481,6 +10897,7 @@
               <w:bottom w:val="nil"/>
               <w:right w:val="nil"/>
             </w:tcBorders>
+            <w:shd w:val="clear" w:color="auto" w:fill="FFFFFF"/>
           </w:tcPr>
           <w:p>
             <w:r/>
@@ -10502,6 +10919,7 @@
               <w:bottom w:val="nil"/>
               <w:right w:val="nil"/>
             </w:tcBorders>
+            <w:shd w:val="clear" w:color="auto" w:fill="FFFFFF"/>
           </w:tcPr>
           <w:p>
             <w:r/>
@@ -10523,6 +10941,7 @@
               <w:bottom w:val="nil"/>
               <w:right w:val="nil"/>
             </w:tcBorders>
+            <w:shd w:val="clear" w:color="auto" w:fill="FFFFFF"/>
           </w:tcPr>
           <w:p>
             <w:r/>
@@ -10546,6 +10965,7 @@
               <w:bottom w:val="nil"/>
               <w:right w:val="nil"/>
             </w:tcBorders>
+            <w:shd w:val="clear" w:color="auto" w:fill="FFFFFF"/>
           </w:tcPr>
           <w:p>
             <w:r/>
@@ -10567,6 +10987,7 @@
               <w:bottom w:val="nil"/>
               <w:right w:val="nil"/>
             </w:tcBorders>
+            <w:shd w:val="clear" w:color="auto" w:fill="FFFFFF"/>
           </w:tcPr>
           <w:p>
             <w:r/>
@@ -10588,6 +11009,7 @@
               <w:bottom w:val="nil"/>
               <w:right w:val="nil"/>
             </w:tcBorders>
+            <w:shd w:val="clear" w:color="auto" w:fill="FFFFFF"/>
           </w:tcPr>
           <w:p>
             <w:r/>
@@ -10609,6 +11031,7 @@
               <w:bottom w:val="nil"/>
               <w:right w:val="nil"/>
             </w:tcBorders>
+            <w:shd w:val="clear" w:color="auto" w:fill="FFFFFF"/>
           </w:tcPr>
           <w:p>
             <w:r/>
@@ -10630,6 +11053,7 @@
               <w:bottom w:val="nil"/>
               <w:right w:val="nil"/>
             </w:tcBorders>
+            <w:shd w:val="clear" w:color="auto" w:fill="FFFFFF"/>
           </w:tcPr>
           <w:p>
             <w:r/>
@@ -10653,6 +11077,7 @@
               <w:bottom w:val="single" w:sz="12" w:space="0" w:color="000000"/>
               <w:right w:val="nil"/>
             </w:tcBorders>
+            <w:shd w:val="clear" w:color="auto" w:fill="FFFFFF"/>
           </w:tcPr>
           <w:p>
             <w:r/>
@@ -10674,6 +11099,7 @@
               <w:bottom w:val="single" w:sz="12" w:space="0" w:color="000000"/>
               <w:right w:val="nil"/>
             </w:tcBorders>
+            <w:shd w:val="clear" w:color="auto" w:fill="FFFFFF"/>
           </w:tcPr>
           <w:p>
             <w:r/>
@@ -10695,6 +11121,7 @@
               <w:bottom w:val="single" w:sz="12" w:space="0" w:color="000000"/>
               <w:right w:val="nil"/>
             </w:tcBorders>
+            <w:shd w:val="clear" w:color="auto" w:fill="FFFFFF"/>
           </w:tcPr>
           <w:p>
             <w:r/>
@@ -10716,6 +11143,7 @@
               <w:bottom w:val="single" w:sz="12" w:space="0" w:color="000000"/>
               <w:right w:val="nil"/>
             </w:tcBorders>
+            <w:shd w:val="clear" w:color="auto" w:fill="FFFFFF"/>
           </w:tcPr>
           <w:p>
             <w:r/>
@@ -10737,6 +11165,7 @@
               <w:bottom w:val="single" w:sz="12" w:space="0" w:color="000000"/>
               <w:right w:val="nil"/>
             </w:tcBorders>
+            <w:shd w:val="clear" w:color="auto" w:fill="FFFFFF"/>
           </w:tcPr>
           <w:p>
             <w:r/>

</xml_diff>